<commit_message>
Move rr_arbiter to common, done width of ahb interconnect port list
</commit_message>
<xml_diff>
--- a/docs/SimpleMCU_MAS.docx
+++ b/docs/SimpleMCU_MAS.docx
@@ -1317,19 +1317,7 @@
                 <w:szCs w:val="20"/>
                 <w:vertAlign w:val="baseline"/>
               </w:rPr>
-              <w:t>USE_A</w:t>
-            </w:r>
-            <w:r>
-              <w:rPr>
-                <w:rFonts w:hint="default" w:asciiTheme="majorEastAsia" w:hAnsiTheme="majorEastAsia" w:eastAsiaTheme="majorEastAsia" w:cstheme="majorEastAsia"/>
-                <w:b w:val="0"/>
-                <w:bCs w:val="0"/>
-                <w:color w:val="auto"/>
-                <w:sz w:val="20"/>
-                <w:szCs w:val="20"/>
-                <w:vertAlign w:val="baseline"/>
-              </w:rPr>
-              <w:t>HB</w:t>
+              <w:t>USE_AHB</w:t>
             </w:r>
           </w:p>
         </w:tc>
@@ -1367,31 +1355,7 @@
                 <w:szCs w:val="20"/>
                 <w:vertAlign w:val="baseline"/>
               </w:rPr>
-              <w:t>Turn on this to use A</w:t>
-            </w:r>
-            <w:r>
-              <w:rPr>
-                <w:rFonts w:hint="default" w:asciiTheme="majorEastAsia" w:hAnsiTheme="majorEastAsia" w:eastAsiaTheme="majorEastAsia" w:cstheme="majorEastAsia"/>
-                <w:b w:val="0"/>
-                <w:bCs w:val="0"/>
-                <w:color w:val="auto"/>
-                <w:sz w:val="20"/>
-                <w:szCs w:val="20"/>
-                <w:vertAlign w:val="baseline"/>
-              </w:rPr>
-              <w:t>HB</w:t>
-            </w:r>
-            <w:r>
-              <w:rPr>
-                <w:rFonts w:hint="default" w:asciiTheme="majorEastAsia" w:hAnsiTheme="majorEastAsia" w:eastAsiaTheme="majorEastAsia" w:cstheme="majorEastAsia"/>
-                <w:b w:val="0"/>
-                <w:bCs w:val="0"/>
-                <w:color w:val="auto"/>
-                <w:sz w:val="20"/>
-                <w:szCs w:val="20"/>
-                <w:vertAlign w:val="baseline"/>
-              </w:rPr>
-              <w:t xml:space="preserve"> as the main bus</w:t>
+              <w:t>Turn on this to use AHB as the main bus</w:t>
             </w:r>
           </w:p>
         </w:tc>
@@ -1429,19 +1393,7 @@
                 <w:szCs w:val="20"/>
                 <w:vertAlign w:val="baseline"/>
               </w:rPr>
-              <w:t>O</w:t>
-            </w:r>
-            <w:r>
-              <w:rPr>
-                <w:rFonts w:hint="default" w:asciiTheme="majorEastAsia" w:hAnsiTheme="majorEastAsia" w:eastAsiaTheme="majorEastAsia" w:cstheme="majorEastAsia"/>
-                <w:b w:val="0"/>
-                <w:bCs w:val="0"/>
-                <w:color w:val="auto"/>
-                <w:sz w:val="20"/>
-                <w:szCs w:val="20"/>
-                <w:vertAlign w:val="baseline"/>
-              </w:rPr>
-              <w:t>n</w:t>
+              <w:t>On</w:t>
             </w:r>
           </w:p>
         </w:tc>
@@ -1614,7 +1566,7 @@
           <w:sz w:val="20"/>
           <w:szCs w:val="20"/>
         </w:rPr>
-        <w:t>*To ON/OFF these defines, modify ‘${PROJ_ROOT}/rtl/spmcu_define_pkg.sv’</w:t>
+        <w:t>*To ON/OFF these defines, modify ‘${PROJ_ROOT}/rtl/spmcu_define.svh’</w:t>
       </w:r>
     </w:p>
     <w:p>
@@ -3422,19 +3374,7 @@
                 <w:szCs w:val="20"/>
                 <w:vertAlign w:val="baseline"/>
               </w:rPr>
-              <w:t>UART interface --------------------------------------------------------------------------------------------------</w:t>
-            </w:r>
-            <w:r>
-              <w:rPr>
-                <w:rFonts w:hint="default" w:asciiTheme="majorEastAsia" w:hAnsiTheme="majorEastAsia" w:eastAsiaTheme="majorEastAsia" w:cstheme="majorEastAsia"/>
-                <w:b/>
-                <w:bCs/>
-                <w:color w:val="auto"/>
-                <w:sz w:val="20"/>
-                <w:szCs w:val="20"/>
-                <w:vertAlign w:val="baseline"/>
-              </w:rPr>
-              <w:t>-</w:t>
+              <w:t>UART interface ---------------------------------------------------------------------------------------------------</w:t>
             </w:r>
           </w:p>
         </w:tc>
@@ -3840,19 +3780,7 @@
                 <w:szCs w:val="20"/>
                 <w:vertAlign w:val="baseline"/>
               </w:rPr>
-              <w:t>I2C interface ------------------------------------------------------------------------------------------------------</w:t>
-            </w:r>
-            <w:r>
-              <w:rPr>
-                <w:rFonts w:hint="default" w:asciiTheme="majorEastAsia" w:hAnsiTheme="majorEastAsia" w:eastAsiaTheme="majorEastAsia" w:cstheme="majorEastAsia"/>
-                <w:b/>
-                <w:bCs/>
-                <w:color w:val="auto"/>
-                <w:sz w:val="20"/>
-                <w:szCs w:val="20"/>
-                <w:vertAlign w:val="baseline"/>
-              </w:rPr>
-              <w:t>-</w:t>
+              <w:t>I2C interface -------------------------------------------------------------------------------------------------------</w:t>
             </w:r>
           </w:p>
         </w:tc>
@@ -4258,19 +4186,7 @@
                 <w:szCs w:val="20"/>
                 <w:vertAlign w:val="baseline"/>
               </w:rPr>
-              <w:t>SPI interface ------------------------------------------------------------------------------------------------------</w:t>
-            </w:r>
-            <w:r>
-              <w:rPr>
-                <w:rFonts w:hint="default" w:asciiTheme="majorEastAsia" w:hAnsiTheme="majorEastAsia" w:eastAsiaTheme="majorEastAsia" w:cstheme="majorEastAsia"/>
-                <w:b/>
-                <w:bCs/>
-                <w:color w:val="auto"/>
-                <w:sz w:val="20"/>
-                <w:szCs w:val="20"/>
-                <w:vertAlign w:val="baseline"/>
-              </w:rPr>
-              <w:t>-</w:t>
+              <w:t>SPI interface -------------------------------------------------------------------------------------------------------</w:t>
             </w:r>
           </w:p>
         </w:tc>
@@ -4676,19 +4592,7 @@
                 <w:szCs w:val="20"/>
                 <w:vertAlign w:val="baseline"/>
               </w:rPr>
-              <w:t>GPIO interface ---------------------------------------------------------------------------------------------------</w:t>
-            </w:r>
-            <w:r>
-              <w:rPr>
-                <w:rFonts w:hint="default" w:asciiTheme="majorEastAsia" w:hAnsiTheme="majorEastAsia" w:eastAsiaTheme="majorEastAsia" w:cstheme="majorEastAsia"/>
-                <w:b/>
-                <w:bCs/>
-                <w:color w:val="auto"/>
-                <w:sz w:val="20"/>
-                <w:szCs w:val="20"/>
-                <w:vertAlign w:val="baseline"/>
-              </w:rPr>
-              <w:t>-</w:t>
+              <w:t>GPIO interface ----------------------------------------------------------------------------------------------------</w:t>
             </w:r>
           </w:p>
         </w:tc>
@@ -5356,33 +5260,7 @@
           <w:sz w:val="20"/>
           <w:szCs w:val="20"/>
         </w:rPr>
-        <w:t>&lt;Block diagram tong quan connection</w:t>
-      </w:r>
-      <w:r>
-        <w:rPr>
-          <w:rFonts w:hint="default" w:asciiTheme="majorEastAsia" w:hAnsiTheme="majorEastAsia" w:eastAsiaTheme="majorEastAsia" w:cstheme="majorEastAsia"/>
-          <w:b w:val="0"/>
-          <w:bCs w:val="0"/>
-          <w:i w:val="0"/>
-          <w:iCs w:val="0"/>
-          <w:color w:val="auto"/>
-          <w:sz w:val="20"/>
-          <w:szCs w:val="20"/>
-        </w:rPr>
-        <w:t xml:space="preserve"> inter, mst, slv</w:t>
-      </w:r>
-      <w:r>
-        <w:rPr>
-          <w:rFonts w:hint="default" w:asciiTheme="majorEastAsia" w:hAnsiTheme="majorEastAsia" w:eastAsiaTheme="majorEastAsia" w:cstheme="majorEastAsia"/>
-          <w:b w:val="0"/>
-          <w:bCs w:val="0"/>
-          <w:i w:val="0"/>
-          <w:iCs w:val="0"/>
-          <w:color w:val="auto"/>
-          <w:sz w:val="20"/>
-          <w:szCs w:val="20"/>
-        </w:rPr>
-        <w:t>&gt;</w:t>
+        <w:t>&lt;Block diagram tong quan connection inter, mst, slv&gt;</w:t>
       </w:r>
     </w:p>
     <w:p>
@@ -5700,7 +5578,20 @@
           <w:sz w:val="20"/>
           <w:szCs w:val="20"/>
         </w:rPr>
-        <w:t>&lt;Chuc nang, tinh nang, diem dac biet&gt;</w:t>
+        <w:t>&lt;Chuc nang, tinh nang, diem dac biet</w:t>
+      </w:r>
+      <w:r>
+        <w:rPr>
+          <w:rFonts w:hint="default" w:asciiTheme="majorEastAsia" w:hAnsiTheme="majorEastAsia" w:eastAsiaTheme="majorEastAsia" w:cstheme="majorEastAsia"/>
+          <w:b w:val="0"/>
+          <w:bCs w:val="0"/>
+          <w:i w:val="0"/>
+          <w:iCs w:val="0"/>
+          <w:color w:val="auto"/>
+          <w:sz w:val="20"/>
+          <w:szCs w:val="20"/>
+        </w:rPr>
+        <w:t>&gt;</w:t>
       </w:r>
     </w:p>
     <w:p>
@@ -5828,8 +5719,6 @@
         </w:rPr>
         <w:t xml:space="preserve"> - AHB Interconnect define macros</w:t>
       </w:r>
-      <w:bookmarkStart w:id="0" w:name="_GoBack"/>
-      <w:bookmarkEnd w:id="0"/>
     </w:p>
     <w:tbl>
       <w:tblPr>
@@ -6157,7 +6046,7 @@
           <w:sz w:val="20"/>
           <w:szCs w:val="20"/>
         </w:rPr>
-        <w:t>*To ON/OFF these defines, modify ‘${PROJ_ROOT}/rtl/</w:t>
+        <w:t>*To ON/OFF these defines, modify ‘${PROJ_ROOT}/rtl/ahb/interconnect/spmcu_ahb_ interconnect_define.sv</w:t>
       </w:r>
       <w:r>
         <w:rPr>
@@ -6170,7 +6059,7 @@
           <w:sz w:val="20"/>
           <w:szCs w:val="20"/>
         </w:rPr>
-        <w:t>ahb/interconnect/</w:t>
+        <w:t>h</w:t>
       </w:r>
       <w:r>
         <w:rPr>
@@ -6183,33 +6072,7 @@
           <w:sz w:val="20"/>
           <w:szCs w:val="20"/>
         </w:rPr>
-        <w:t>spmcu_</w:t>
-      </w:r>
-      <w:r>
-        <w:rPr>
-          <w:rFonts w:hint="default" w:asciiTheme="majorEastAsia" w:hAnsiTheme="majorEastAsia" w:eastAsiaTheme="majorEastAsia" w:cstheme="majorEastAsia"/>
-          <w:b w:val="0"/>
-          <w:bCs w:val="0"/>
-          <w:i w:val="0"/>
-          <w:iCs w:val="0"/>
-          <w:color w:val="auto"/>
-          <w:sz w:val="20"/>
-          <w:szCs w:val="20"/>
-        </w:rPr>
-        <w:t>ahb_ interconnect_</w:t>
-      </w:r>
-      <w:r>
-        <w:rPr>
-          <w:rFonts w:hint="default" w:asciiTheme="majorEastAsia" w:hAnsiTheme="majorEastAsia" w:eastAsiaTheme="majorEastAsia" w:cstheme="majorEastAsia"/>
-          <w:b w:val="0"/>
-          <w:bCs w:val="0"/>
-          <w:i w:val="0"/>
-          <w:iCs w:val="0"/>
-          <w:color w:val="auto"/>
-          <w:sz w:val="20"/>
-          <w:szCs w:val="20"/>
-        </w:rPr>
-        <w:t>define_pkg.sv’</w:t>
+        <w:t>’</w:t>
       </w:r>
     </w:p>
     <w:p>
@@ -7067,10 +6930,68 @@
         <w:t>Port List</w:t>
       </w:r>
     </w:p>
+    <w:p>
+      <w:pPr>
+        <w:pStyle w:val="2"/>
+        <w:rPr>
+          <w:rFonts w:hint="eastAsia" w:asciiTheme="minorEastAsia" w:hAnsiTheme="minorEastAsia" w:eastAsiaTheme="minorEastAsia" w:cstheme="minorEastAsia"/>
+          <w:color w:val="002060"/>
+        </w:rPr>
+      </w:pPr>
+      <w:r>
+        <w:rPr>
+          <w:rFonts w:hint="eastAsia" w:asciiTheme="minorEastAsia" w:hAnsiTheme="minorEastAsia" w:eastAsiaTheme="minorEastAsia" w:cstheme="minorEastAsia"/>
+          <w:color w:val="002060"/>
+        </w:rPr>
+        <w:t xml:space="preserve">Table </w:t>
+      </w:r>
+      <w:r>
+        <w:rPr>
+          <w:rFonts w:hint="eastAsia" w:asciiTheme="minorEastAsia" w:hAnsiTheme="minorEastAsia" w:eastAsiaTheme="minorEastAsia" w:cstheme="minorEastAsia"/>
+          <w:color w:val="002060"/>
+        </w:rPr>
+        <w:fldChar w:fldCharType="begin"/>
+      </w:r>
+      <w:r>
+        <w:rPr>
+          <w:rFonts w:hint="eastAsia" w:asciiTheme="minorEastAsia" w:hAnsiTheme="minorEastAsia" w:eastAsiaTheme="minorEastAsia" w:cstheme="minorEastAsia"/>
+          <w:color w:val="002060"/>
+        </w:rPr>
+        <w:instrText xml:space="preserve"> SEQ Table \* ARABIC </w:instrText>
+      </w:r>
+      <w:r>
+        <w:rPr>
+          <w:rFonts w:hint="eastAsia" w:asciiTheme="minorEastAsia" w:hAnsiTheme="minorEastAsia" w:eastAsiaTheme="minorEastAsia" w:cstheme="minorEastAsia"/>
+          <w:color w:val="002060"/>
+        </w:rPr>
+        <w:fldChar w:fldCharType="separate"/>
+      </w:r>
+      <w:r>
+        <w:rPr>
+          <w:rFonts w:hint="eastAsia" w:asciiTheme="minorEastAsia" w:hAnsiTheme="minorEastAsia" w:eastAsiaTheme="minorEastAsia" w:cstheme="minorEastAsia"/>
+          <w:color w:val="002060"/>
+        </w:rPr>
+        <w:t>6</w:t>
+      </w:r>
+      <w:r>
+        <w:rPr>
+          <w:rFonts w:hint="eastAsia" w:asciiTheme="minorEastAsia" w:hAnsiTheme="minorEastAsia" w:eastAsiaTheme="minorEastAsia" w:cstheme="minorEastAsia"/>
+          <w:color w:val="002060"/>
+        </w:rPr>
+        <w:fldChar w:fldCharType="end"/>
+      </w:r>
+      <w:r>
+        <w:rPr>
+          <w:rFonts w:hint="eastAsia" w:asciiTheme="minorEastAsia" w:hAnsiTheme="minorEastAsia" w:eastAsiaTheme="minorEastAsia" w:cstheme="minorEastAsia"/>
+          <w:color w:val="002060"/>
+        </w:rPr>
+        <w:t xml:space="preserve"> - AHB Interconnect port list</w:t>
+      </w:r>
+    </w:p>
     <w:tbl>
       <w:tblPr>
         <w:tblStyle w:val="5"/>
-        <w:tblW w:w="8550" w:type="dxa"/>
+        <w:tblW w:w="8522" w:type="dxa"/>
         <w:tblInd w:w="0" w:type="dxa"/>
         <w:tblBorders>
           <w:top w:val="single" w:color="auto" w:sz="4" w:space="0"/>
@@ -7092,8 +7013,8 @@
       <w:tblGrid>
         <w:gridCol w:w="2319"/>
         <w:gridCol w:w="840"/>
-        <w:gridCol w:w="1150"/>
-        <w:gridCol w:w="4241"/>
+        <w:gridCol w:w="1368"/>
+        <w:gridCol w:w="3995"/>
       </w:tblGrid>
       <w:tr>
         <w:tblPrEx>
@@ -7199,7 +7120,7 @@
         </w:tc>
         <w:tc>
           <w:tcPr>
-            <w:tcW w:w="1150" w:type="dxa"/>
+            <w:tcW w:w="1368" w:type="dxa"/>
             <w:tcBorders>
               <w:tl2br w:val="nil"/>
               <w:tr2bl w:val="nil"/>
@@ -7239,7 +7160,7 @@
         </w:tc>
         <w:tc>
           <w:tcPr>
-            <w:tcW w:w="4241" w:type="dxa"/>
+            <w:tcW w:w="3995" w:type="dxa"/>
             <w:tcBorders>
               <w:tl2br w:val="nil"/>
               <w:tr2bl w:val="nil"/>
@@ -7380,7 +7301,7 @@
         </w:tc>
         <w:tc>
           <w:tcPr>
-            <w:tcW w:w="1150" w:type="dxa"/>
+            <w:tcW w:w="1368" w:type="dxa"/>
             <w:tcBorders>
               <w:tl2br w:val="nil"/>
               <w:tr2bl w:val="nil"/>
@@ -7419,7 +7340,7 @@
         </w:tc>
         <w:tc>
           <w:tcPr>
-            <w:tcW w:w="4241" w:type="dxa"/>
+            <w:tcW w:w="3995" w:type="dxa"/>
             <w:tcBorders>
               <w:tl2br w:val="nil"/>
               <w:tr2bl w:val="nil"/>
@@ -7559,7 +7480,7 @@
         </w:tc>
         <w:tc>
           <w:tcPr>
-            <w:tcW w:w="1150" w:type="dxa"/>
+            <w:tcW w:w="1368" w:type="dxa"/>
             <w:tcBorders>
               <w:tl2br w:val="nil"/>
               <w:tr2bl w:val="nil"/>
@@ -7598,7 +7519,7 @@
         </w:tc>
         <w:tc>
           <w:tcPr>
-            <w:tcW w:w="4241" w:type="dxa"/>
+            <w:tcW w:w="3995" w:type="dxa"/>
             <w:tcBorders>
               <w:tl2br w:val="nil"/>
               <w:tr2bl w:val="nil"/>
@@ -7660,7 +7581,7 @@
         </w:trPr>
         <w:tc>
           <w:tcPr>
-            <w:tcW w:w="8550" w:type="dxa"/>
+            <w:tcW w:w="8522" w:type="dxa"/>
             <w:gridSpan w:val="4"/>
             <w:tcBorders>
               <w:tl2br w:val="nil"/>
@@ -7694,7 +7615,7 @@
                 <w:szCs w:val="20"/>
                 <w:vertAlign w:val="baseline"/>
               </w:rPr>
-              <w:t>AHB Master side -------------------------------------------------------------------------------------------------</w:t>
+              <w:t>AHB</w:t>
             </w:r>
             <w:r>
               <w:rPr>
@@ -7706,7 +7627,19 @@
                 <w:szCs w:val="20"/>
                 <w:vertAlign w:val="baseline"/>
               </w:rPr>
-              <w:t>-</w:t>
+              <w:t xml:space="preserve"> Master</w:t>
+            </w:r>
+            <w:r>
+              <w:rPr>
+                <w:rFonts w:hint="default" w:asciiTheme="majorEastAsia" w:hAnsiTheme="majorEastAsia" w:eastAsiaTheme="majorEastAsia" w:cstheme="majorEastAsia"/>
+                <w:b/>
+                <w:bCs/>
+                <w:color w:val="auto"/>
+                <w:sz w:val="20"/>
+                <w:szCs w:val="20"/>
+                <w:vertAlign w:val="baseline"/>
+              </w:rPr>
+              <w:t xml:space="preserve"> side --------------------------------------------------------------------------------------------------</w:t>
             </w:r>
           </w:p>
         </w:tc>
@@ -7748,38 +7681,38 @@
               <w:widowControl w:val="0"/>
               <w:jc w:val="left"/>
               <w:rPr>
-                <w:rFonts w:hint="default" w:asciiTheme="majorEastAsia" w:hAnsiTheme="majorEastAsia" w:eastAsiaTheme="majorEastAsia" w:cstheme="majorEastAsia"/>
-                <w:b w:val="0"/>
-                <w:bCs w:val="0"/>
-                <w:color w:val="auto"/>
-                <w:sz w:val="20"/>
-                <w:szCs w:val="20"/>
-                <w:vertAlign w:val="baseline"/>
-              </w:rPr>
-            </w:pPr>
-            <w:r>
-              <w:rPr>
-                <w:rFonts w:hint="default" w:asciiTheme="majorEastAsia" w:hAnsiTheme="majorEastAsia" w:eastAsiaTheme="majorEastAsia" w:cstheme="majorEastAsia"/>
-                <w:b w:val="0"/>
-                <w:bCs w:val="0"/>
-                <w:color w:val="auto"/>
-                <w:sz w:val="20"/>
-                <w:szCs w:val="20"/>
-                <w:vertAlign w:val="baseline"/>
-              </w:rPr>
-              <w:t>mst_hrdata</w:t>
-            </w:r>
-            <w:r>
-              <w:rPr>
-                <w:rFonts w:hint="default" w:asciiTheme="majorEastAsia" w:hAnsiTheme="majorEastAsia" w:eastAsiaTheme="majorEastAsia" w:cstheme="majorEastAsia"/>
-                <w:b w:val="0"/>
-                <w:bCs w:val="0"/>
-                <w:color w:val="auto"/>
-                <w:sz w:val="20"/>
-                <w:szCs w:val="20"/>
-                <w:vertAlign w:val="baseline"/>
-              </w:rPr>
-              <w:t>_i</w:t>
+                <w:rFonts w:hint="eastAsia" w:asciiTheme="majorEastAsia" w:hAnsiTheme="majorEastAsia" w:eastAsiaTheme="majorEastAsia" w:cstheme="majorEastAsia"/>
+                <w:b w:val="0"/>
+                <w:bCs w:val="0"/>
+                <w:color w:val="auto"/>
+                <w:sz w:val="20"/>
+                <w:szCs w:val="20"/>
+                <w:vertAlign w:val="baseline"/>
+              </w:rPr>
+            </w:pPr>
+            <w:r>
+              <w:rPr>
+                <w:rFonts w:hint="default" w:asciiTheme="majorEastAsia" w:hAnsiTheme="majorEastAsia" w:eastAsiaTheme="majorEastAsia" w:cstheme="majorEastAsia"/>
+                <w:b w:val="0"/>
+                <w:bCs w:val="0"/>
+                <w:color w:val="auto"/>
+                <w:sz w:val="20"/>
+                <w:szCs w:val="20"/>
+                <w:vertAlign w:val="baseline"/>
+              </w:rPr>
+              <w:t>mst_haddr_</w:t>
+            </w:r>
+            <w:r>
+              <w:rPr>
+                <w:rFonts w:hint="default" w:asciiTheme="majorEastAsia" w:hAnsiTheme="majorEastAsia" w:eastAsiaTheme="majorEastAsia" w:cstheme="majorEastAsia"/>
+                <w:b w:val="0"/>
+                <w:bCs w:val="0"/>
+                <w:color w:val="auto"/>
+                <w:sz w:val="20"/>
+                <w:szCs w:val="20"/>
+                <w:vertAlign w:val="baseline"/>
+              </w:rPr>
+              <w:t>i</w:t>
             </w:r>
           </w:p>
         </w:tc>
@@ -7798,7 +7731,7 @@
               <w:widowControl w:val="0"/>
               <w:jc w:val="left"/>
               <w:rPr>
-                <w:rFonts w:hint="default" w:asciiTheme="majorEastAsia" w:hAnsiTheme="majorEastAsia" w:eastAsiaTheme="majorEastAsia" w:cstheme="majorEastAsia"/>
+                <w:rFonts w:hint="eastAsia" w:asciiTheme="majorEastAsia" w:hAnsiTheme="majorEastAsia" w:eastAsiaTheme="majorEastAsia" w:cstheme="majorEastAsia"/>
                 <w:b w:val="0"/>
                 <w:bCs w:val="0"/>
                 <w:color w:val="auto"/>
@@ -7823,46 +7756,7 @@
         </w:tc>
         <w:tc>
           <w:tcPr>
-            <w:tcW w:w="1150" w:type="dxa"/>
-            <w:tcBorders>
-              <w:tl2br w:val="nil"/>
-              <w:tr2bl w:val="nil"/>
-            </w:tcBorders>
-            <w:shd w:val="clear" w:color="auto" w:fill="auto"/>
-            <w:textDirection w:val="lrTbV"/>
-            <w:vAlign w:val="center"/>
-          </w:tcPr>
-          <w:p>
-            <w:pPr>
-              <w:widowControl w:val="0"/>
-              <w:jc w:val="both"/>
-              <w:rPr>
-                <w:rFonts w:hint="default" w:asciiTheme="majorEastAsia" w:hAnsiTheme="majorEastAsia" w:eastAsiaTheme="majorEastAsia" w:cstheme="majorEastAsia"/>
-                <w:b w:val="0"/>
-                <w:bCs w:val="0"/>
-                <w:color w:val="auto"/>
-                <w:sz w:val="20"/>
-                <w:szCs w:val="20"/>
-                <w:vertAlign w:val="baseline"/>
-              </w:rPr>
-            </w:pPr>
-            <w:r>
-              <w:rPr>
-                <w:rFonts w:hint="default" w:asciiTheme="majorEastAsia" w:hAnsiTheme="majorEastAsia" w:eastAsiaTheme="majorEastAsia" w:cstheme="majorEastAsia"/>
-                <w:b w:val="0"/>
-                <w:bCs w:val="0"/>
-                <w:color w:val="auto"/>
-                <w:sz w:val="20"/>
-                <w:szCs w:val="20"/>
-                <w:vertAlign w:val="baseline"/>
-              </w:rPr>
-              <w:t>NMxDW</w:t>
-            </w:r>
-          </w:p>
-        </w:tc>
-        <w:tc>
-          <w:tcPr>
-            <w:tcW w:w="4241" w:type="dxa"/>
+            <w:tcW w:w="1368" w:type="dxa"/>
             <w:tcBorders>
               <w:tl2br w:val="nil"/>
               <w:tr2bl w:val="nil"/>
@@ -7875,15 +7769,65 @@
               <w:widowControl w:val="0"/>
               <w:jc w:val="left"/>
               <w:rPr>
-                <w:rFonts w:hint="default" w:asciiTheme="majorEastAsia" w:hAnsiTheme="majorEastAsia" w:eastAsiaTheme="majorEastAsia" w:cstheme="majorEastAsia"/>
-                <w:b w:val="0"/>
-                <w:bCs w:val="0"/>
-                <w:color w:val="auto"/>
-                <w:sz w:val="20"/>
-                <w:szCs w:val="20"/>
-                <w:vertAlign w:val="baseline"/>
-              </w:rPr>
-            </w:pPr>
+                <w:rFonts w:hint="eastAsia" w:asciiTheme="majorEastAsia" w:hAnsiTheme="majorEastAsia" w:eastAsiaTheme="majorEastAsia" w:cstheme="majorEastAsia"/>
+                <w:b w:val="0"/>
+                <w:bCs w:val="0"/>
+                <w:color w:val="auto"/>
+                <w:sz w:val="20"/>
+                <w:szCs w:val="20"/>
+                <w:vertAlign w:val="baseline"/>
+              </w:rPr>
+            </w:pPr>
+            <w:r>
+              <w:rPr>
+                <w:rFonts w:hint="default" w:asciiTheme="majorEastAsia" w:hAnsiTheme="majorEastAsia" w:eastAsiaTheme="majorEastAsia" w:cstheme="majorEastAsia"/>
+                <w:b w:val="0"/>
+                <w:bCs w:val="0"/>
+                <w:color w:val="auto"/>
+                <w:sz w:val="20"/>
+                <w:szCs w:val="20"/>
+                <w:vertAlign w:val="baseline"/>
+              </w:rPr>
+              <w:t>NMxAW</w:t>
+            </w:r>
+          </w:p>
+        </w:tc>
+        <w:tc>
+          <w:tcPr>
+            <w:tcW w:w="3995" w:type="dxa"/>
+            <w:tcBorders>
+              <w:tl2br w:val="nil"/>
+              <w:tr2bl w:val="nil"/>
+            </w:tcBorders>
+            <w:shd w:val="clear" w:color="auto" w:fill="auto"/>
+            <w:vAlign w:val="top"/>
+          </w:tcPr>
+          <w:p>
+            <w:pPr>
+              <w:widowControl w:val="0"/>
+              <w:jc w:val="left"/>
+              <w:rPr>
+                <w:rFonts w:hint="eastAsia" w:asciiTheme="majorEastAsia" w:hAnsiTheme="majorEastAsia" w:eastAsiaTheme="majorEastAsia" w:cstheme="majorEastAsia"/>
+                <w:b w:val="0"/>
+                <w:bCs w:val="0"/>
+                <w:color w:val="auto"/>
+                <w:sz w:val="20"/>
+                <w:szCs w:val="20"/>
+                <w:vertAlign w:val="baseline"/>
+              </w:rPr>
+            </w:pPr>
+            <w:r>
+              <w:rPr>
+                <w:rFonts w:hint="default" w:asciiTheme="majorEastAsia" w:hAnsiTheme="majorEastAsia" w:eastAsiaTheme="majorEastAsia" w:cstheme="majorEastAsia"/>
+                <w:b w:val="0"/>
+                <w:bCs w:val="0"/>
+                <w:color w:val="auto"/>
+                <w:sz w:val="20"/>
+                <w:szCs w:val="20"/>
+                <w:vertAlign w:val="baseline"/>
+              </w:rPr>
+              <w:t>Byte address of transfer</w:t>
+            </w:r>
           </w:p>
         </w:tc>
       </w:tr>
@@ -7924,38 +7868,38 @@
               <w:widowControl w:val="0"/>
               <w:jc w:val="left"/>
               <w:rPr>
-                <w:rFonts w:hint="default" w:asciiTheme="majorEastAsia" w:hAnsiTheme="majorEastAsia" w:eastAsiaTheme="majorEastAsia" w:cstheme="majorEastAsia"/>
-                <w:b w:val="0"/>
-                <w:bCs w:val="0"/>
-                <w:color w:val="auto"/>
-                <w:sz w:val="20"/>
-                <w:szCs w:val="20"/>
-                <w:vertAlign w:val="baseline"/>
-              </w:rPr>
-            </w:pPr>
-            <w:r>
-              <w:rPr>
-                <w:rFonts w:hint="default" w:asciiTheme="majorEastAsia" w:hAnsiTheme="majorEastAsia" w:eastAsiaTheme="majorEastAsia" w:cstheme="majorEastAsia"/>
-                <w:b w:val="0"/>
-                <w:bCs w:val="0"/>
-                <w:color w:val="auto"/>
-                <w:sz w:val="20"/>
-                <w:szCs w:val="20"/>
-                <w:vertAlign w:val="baseline"/>
-              </w:rPr>
-              <w:t>mst_hresp</w:t>
-            </w:r>
-            <w:r>
-              <w:rPr>
-                <w:rFonts w:hint="default" w:asciiTheme="majorEastAsia" w:hAnsiTheme="majorEastAsia" w:eastAsiaTheme="majorEastAsia" w:cstheme="majorEastAsia"/>
-                <w:b w:val="0"/>
-                <w:bCs w:val="0"/>
-                <w:color w:val="auto"/>
-                <w:sz w:val="20"/>
-                <w:szCs w:val="20"/>
-                <w:vertAlign w:val="baseline"/>
-              </w:rPr>
-              <w:t>_i</w:t>
+                <w:rFonts w:hint="eastAsia" w:asciiTheme="majorEastAsia" w:hAnsiTheme="majorEastAsia" w:eastAsiaTheme="majorEastAsia" w:cstheme="majorEastAsia"/>
+                <w:b w:val="0"/>
+                <w:bCs w:val="0"/>
+                <w:color w:val="auto"/>
+                <w:sz w:val="20"/>
+                <w:szCs w:val="20"/>
+                <w:vertAlign w:val="baseline"/>
+              </w:rPr>
+            </w:pPr>
+            <w:r>
+              <w:rPr>
+                <w:rFonts w:hint="default" w:asciiTheme="majorEastAsia" w:hAnsiTheme="majorEastAsia" w:eastAsiaTheme="majorEastAsia" w:cstheme="majorEastAsia"/>
+                <w:b w:val="0"/>
+                <w:bCs w:val="0"/>
+                <w:color w:val="auto"/>
+                <w:sz w:val="20"/>
+                <w:szCs w:val="20"/>
+                <w:vertAlign w:val="baseline"/>
+              </w:rPr>
+              <w:t>mst_hburst_</w:t>
+            </w:r>
+            <w:r>
+              <w:rPr>
+                <w:rFonts w:hint="default" w:asciiTheme="majorEastAsia" w:hAnsiTheme="majorEastAsia" w:eastAsiaTheme="majorEastAsia" w:cstheme="majorEastAsia"/>
+                <w:b w:val="0"/>
+                <w:bCs w:val="0"/>
+                <w:color w:val="auto"/>
+                <w:sz w:val="20"/>
+                <w:szCs w:val="20"/>
+                <w:vertAlign w:val="baseline"/>
+              </w:rPr>
+              <w:t>i</w:t>
             </w:r>
           </w:p>
         </w:tc>
@@ -7999,46 +7943,7 @@
         </w:tc>
         <w:tc>
           <w:tcPr>
-            <w:tcW w:w="1150" w:type="dxa"/>
-            <w:tcBorders>
-              <w:tl2br w:val="nil"/>
-              <w:tr2bl w:val="nil"/>
-            </w:tcBorders>
-            <w:shd w:val="clear" w:color="auto" w:fill="auto"/>
-            <w:textDirection w:val="lrTbV"/>
-            <w:vAlign w:val="center"/>
-          </w:tcPr>
-          <w:p>
-            <w:pPr>
-              <w:widowControl w:val="0"/>
-              <w:jc w:val="both"/>
-              <w:rPr>
-                <w:rFonts w:hint="default" w:asciiTheme="majorEastAsia" w:hAnsiTheme="majorEastAsia" w:eastAsiaTheme="majorEastAsia" w:cstheme="majorEastAsia"/>
-                <w:b w:val="0"/>
-                <w:bCs w:val="0"/>
-                <w:color w:val="auto"/>
-                <w:sz w:val="20"/>
-                <w:szCs w:val="20"/>
-                <w:vertAlign w:val="baseline"/>
-              </w:rPr>
-            </w:pPr>
-            <w:r>
-              <w:rPr>
-                <w:rFonts w:hint="default" w:asciiTheme="majorEastAsia" w:hAnsiTheme="majorEastAsia" w:eastAsiaTheme="majorEastAsia" w:cstheme="majorEastAsia"/>
-                <w:b w:val="0"/>
-                <w:bCs w:val="0"/>
-                <w:color w:val="auto"/>
-                <w:sz w:val="20"/>
-                <w:szCs w:val="20"/>
-                <w:vertAlign w:val="baseline"/>
-              </w:rPr>
-              <w:t>NM</w:t>
-            </w:r>
-          </w:p>
-        </w:tc>
-        <w:tc>
-          <w:tcPr>
-            <w:tcW w:w="4241" w:type="dxa"/>
+            <w:tcW w:w="1368" w:type="dxa"/>
             <w:tcBorders>
               <w:tl2br w:val="nil"/>
               <w:tr2bl w:val="nil"/>
@@ -8051,7 +7956,45 @@
               <w:widowControl w:val="0"/>
               <w:jc w:val="left"/>
               <w:rPr>
-                <w:rFonts w:hint="default" w:asciiTheme="majorEastAsia" w:hAnsiTheme="majorEastAsia" w:eastAsiaTheme="majorEastAsia" w:cstheme="majorEastAsia"/>
+                <w:rFonts w:hint="eastAsia" w:asciiTheme="majorEastAsia" w:hAnsiTheme="majorEastAsia" w:eastAsiaTheme="majorEastAsia" w:cstheme="majorEastAsia"/>
+                <w:b w:val="0"/>
+                <w:bCs w:val="0"/>
+                <w:color w:val="auto"/>
+                <w:sz w:val="20"/>
+                <w:szCs w:val="20"/>
+                <w:vertAlign w:val="baseline"/>
+              </w:rPr>
+            </w:pPr>
+            <w:r>
+              <w:rPr>
+                <w:rFonts w:hint="default" w:asciiTheme="majorEastAsia" w:hAnsiTheme="majorEastAsia" w:eastAsiaTheme="majorEastAsia" w:cstheme="majorEastAsia"/>
+                <w:b w:val="0"/>
+                <w:bCs w:val="0"/>
+                <w:color w:val="auto"/>
+                <w:sz w:val="20"/>
+                <w:szCs w:val="20"/>
+                <w:vertAlign w:val="baseline"/>
+              </w:rPr>
+              <w:t>NMx3</w:t>
+            </w:r>
+          </w:p>
+        </w:tc>
+        <w:tc>
+          <w:tcPr>
+            <w:tcW w:w="3995" w:type="dxa"/>
+            <w:tcBorders>
+              <w:tl2br w:val="nil"/>
+              <w:tr2bl w:val="nil"/>
+            </w:tcBorders>
+            <w:shd w:val="clear" w:color="auto" w:fill="auto"/>
+            <w:vAlign w:val="top"/>
+          </w:tcPr>
+          <w:p>
+            <w:pPr>
+              <w:widowControl w:val="0"/>
+              <w:jc w:val="left"/>
+              <w:rPr>
+                <w:rFonts w:hint="eastAsia" w:asciiTheme="majorEastAsia" w:hAnsiTheme="majorEastAsia" w:eastAsiaTheme="majorEastAsia" w:cstheme="majorEastAsia"/>
                 <w:b w:val="0"/>
                 <w:bCs w:val="0"/>
                 <w:color w:val="auto"/>
@@ -8119,19 +8062,19 @@
                 <w:szCs w:val="20"/>
                 <w:vertAlign w:val="baseline"/>
               </w:rPr>
-              <w:t>mst_hready</w:t>
-            </w:r>
-            <w:r>
-              <w:rPr>
-                <w:rFonts w:hint="default" w:asciiTheme="majorEastAsia" w:hAnsiTheme="majorEastAsia" w:eastAsiaTheme="majorEastAsia" w:cstheme="majorEastAsia"/>
-                <w:b w:val="0"/>
-                <w:bCs w:val="0"/>
-                <w:color w:val="auto"/>
-                <w:sz w:val="20"/>
-                <w:szCs w:val="20"/>
-                <w:vertAlign w:val="baseline"/>
-              </w:rPr>
-              <w:t>_i</w:t>
+              <w:t>mst_hsize_</w:t>
+            </w:r>
+            <w:r>
+              <w:rPr>
+                <w:rFonts w:hint="default" w:asciiTheme="majorEastAsia" w:hAnsiTheme="majorEastAsia" w:eastAsiaTheme="majorEastAsia" w:cstheme="majorEastAsia"/>
+                <w:b w:val="0"/>
+                <w:bCs w:val="0"/>
+                <w:color w:val="auto"/>
+                <w:sz w:val="20"/>
+                <w:szCs w:val="20"/>
+                <w:vertAlign w:val="baseline"/>
+              </w:rPr>
+              <w:t>i</w:t>
             </w:r>
           </w:p>
         </w:tc>
@@ -8175,46 +8118,7 @@
         </w:tc>
         <w:tc>
           <w:tcPr>
-            <w:tcW w:w="1150" w:type="dxa"/>
-            <w:tcBorders>
-              <w:tl2br w:val="nil"/>
-              <w:tr2bl w:val="nil"/>
-            </w:tcBorders>
-            <w:shd w:val="clear" w:color="auto" w:fill="auto"/>
-            <w:textDirection w:val="lrTbV"/>
-            <w:vAlign w:val="center"/>
-          </w:tcPr>
-          <w:p>
-            <w:pPr>
-              <w:widowControl w:val="0"/>
-              <w:jc w:val="both"/>
-              <w:rPr>
-                <w:rFonts w:hint="default" w:asciiTheme="majorEastAsia" w:hAnsiTheme="majorEastAsia" w:eastAsiaTheme="majorEastAsia" w:cstheme="majorEastAsia"/>
-                <w:b w:val="0"/>
-                <w:bCs w:val="0"/>
-                <w:color w:val="auto"/>
-                <w:sz w:val="20"/>
-                <w:szCs w:val="20"/>
-                <w:vertAlign w:val="baseline"/>
-              </w:rPr>
-            </w:pPr>
-            <w:r>
-              <w:rPr>
-                <w:rFonts w:hint="default" w:asciiTheme="majorEastAsia" w:hAnsiTheme="majorEastAsia" w:eastAsiaTheme="majorEastAsia" w:cstheme="majorEastAsia"/>
-                <w:b w:val="0"/>
-                <w:bCs w:val="0"/>
-                <w:color w:val="auto"/>
-                <w:sz w:val="20"/>
-                <w:szCs w:val="20"/>
-                <w:vertAlign w:val="baseline"/>
-              </w:rPr>
-              <w:t>NM</w:t>
-            </w:r>
-          </w:p>
-        </w:tc>
-        <w:tc>
-          <w:tcPr>
-            <w:tcW w:w="4241" w:type="dxa"/>
+            <w:tcW w:w="1368" w:type="dxa"/>
             <w:tcBorders>
               <w:tl2br w:val="nil"/>
               <w:tr2bl w:val="nil"/>
@@ -8227,7 +8131,45 @@
               <w:widowControl w:val="0"/>
               <w:jc w:val="left"/>
               <w:rPr>
-                <w:rFonts w:hint="default" w:asciiTheme="majorEastAsia" w:hAnsiTheme="majorEastAsia" w:eastAsiaTheme="majorEastAsia" w:cstheme="majorEastAsia"/>
+                <w:rFonts w:hint="eastAsia" w:asciiTheme="majorEastAsia" w:hAnsiTheme="majorEastAsia" w:eastAsiaTheme="majorEastAsia" w:cstheme="majorEastAsia"/>
+                <w:b w:val="0"/>
+                <w:bCs w:val="0"/>
+                <w:color w:val="auto"/>
+                <w:sz w:val="20"/>
+                <w:szCs w:val="20"/>
+                <w:vertAlign w:val="baseline"/>
+              </w:rPr>
+            </w:pPr>
+            <w:r>
+              <w:rPr>
+                <w:rFonts w:hint="default" w:asciiTheme="majorEastAsia" w:hAnsiTheme="majorEastAsia" w:eastAsiaTheme="majorEastAsia" w:cstheme="majorEastAsia"/>
+                <w:b w:val="0"/>
+                <w:bCs w:val="0"/>
+                <w:color w:val="auto"/>
+                <w:sz w:val="20"/>
+                <w:szCs w:val="20"/>
+                <w:vertAlign w:val="baseline"/>
+              </w:rPr>
+              <w:t>NMx3</w:t>
+            </w:r>
+          </w:p>
+        </w:tc>
+        <w:tc>
+          <w:tcPr>
+            <w:tcW w:w="3995" w:type="dxa"/>
+            <w:tcBorders>
+              <w:tl2br w:val="nil"/>
+              <w:tr2bl w:val="nil"/>
+            </w:tcBorders>
+            <w:shd w:val="clear" w:color="auto" w:fill="auto"/>
+            <w:vAlign w:val="top"/>
+          </w:tcPr>
+          <w:p>
+            <w:pPr>
+              <w:widowControl w:val="0"/>
+              <w:jc w:val="left"/>
+              <w:rPr>
+                <w:rFonts w:hint="eastAsia" w:asciiTheme="majorEastAsia" w:hAnsiTheme="majorEastAsia" w:eastAsiaTheme="majorEastAsia" w:cstheme="majorEastAsia"/>
                 <w:b w:val="0"/>
                 <w:bCs w:val="0"/>
                 <w:color w:val="auto"/>
@@ -8276,38 +8218,38 @@
               <w:widowControl w:val="0"/>
               <w:jc w:val="left"/>
               <w:rPr>
-                <w:rFonts w:hint="eastAsia" w:asciiTheme="majorEastAsia" w:hAnsiTheme="majorEastAsia" w:eastAsiaTheme="majorEastAsia" w:cstheme="majorEastAsia"/>
-                <w:b w:val="0"/>
-                <w:bCs w:val="0"/>
-                <w:color w:val="auto"/>
-                <w:sz w:val="20"/>
-                <w:szCs w:val="20"/>
-                <w:vertAlign w:val="baseline"/>
-              </w:rPr>
-            </w:pPr>
-            <w:r>
-              <w:rPr>
-                <w:rFonts w:hint="default" w:asciiTheme="majorEastAsia" w:hAnsiTheme="majorEastAsia" w:eastAsiaTheme="majorEastAsia" w:cstheme="majorEastAsia"/>
-                <w:b w:val="0"/>
-                <w:bCs w:val="0"/>
-                <w:color w:val="auto"/>
-                <w:sz w:val="20"/>
-                <w:szCs w:val="20"/>
-                <w:vertAlign w:val="baseline"/>
-              </w:rPr>
-              <w:t>mst_haddr</w:t>
-            </w:r>
-            <w:r>
-              <w:rPr>
-                <w:rFonts w:hint="default" w:asciiTheme="majorEastAsia" w:hAnsiTheme="majorEastAsia" w:eastAsiaTheme="majorEastAsia" w:cstheme="majorEastAsia"/>
-                <w:b w:val="0"/>
-                <w:bCs w:val="0"/>
-                <w:color w:val="auto"/>
-                <w:sz w:val="20"/>
-                <w:szCs w:val="20"/>
-                <w:vertAlign w:val="baseline"/>
-              </w:rPr>
-              <w:t>_o</w:t>
+                <w:rFonts w:hint="default" w:asciiTheme="majorEastAsia" w:hAnsiTheme="majorEastAsia" w:eastAsiaTheme="majorEastAsia" w:cstheme="majorEastAsia"/>
+                <w:b w:val="0"/>
+                <w:bCs w:val="0"/>
+                <w:color w:val="auto"/>
+                <w:sz w:val="20"/>
+                <w:szCs w:val="20"/>
+                <w:vertAlign w:val="baseline"/>
+              </w:rPr>
+            </w:pPr>
+            <w:r>
+              <w:rPr>
+                <w:rFonts w:hint="default" w:asciiTheme="majorEastAsia" w:hAnsiTheme="majorEastAsia" w:eastAsiaTheme="majorEastAsia" w:cstheme="majorEastAsia"/>
+                <w:b w:val="0"/>
+                <w:bCs w:val="0"/>
+                <w:color w:val="auto"/>
+                <w:sz w:val="20"/>
+                <w:szCs w:val="20"/>
+                <w:vertAlign w:val="baseline"/>
+              </w:rPr>
+              <w:t>mst_htrans_</w:t>
+            </w:r>
+            <w:r>
+              <w:rPr>
+                <w:rFonts w:hint="default" w:asciiTheme="majorEastAsia" w:hAnsiTheme="majorEastAsia" w:eastAsiaTheme="majorEastAsia" w:cstheme="majorEastAsia"/>
+                <w:b w:val="0"/>
+                <w:bCs w:val="0"/>
+                <w:color w:val="auto"/>
+                <w:sz w:val="20"/>
+                <w:szCs w:val="20"/>
+                <w:vertAlign w:val="baseline"/>
+              </w:rPr>
+              <w:t>i</w:t>
             </w:r>
           </w:p>
         </w:tc>
@@ -8326,32 +8268,32 @@
               <w:widowControl w:val="0"/>
               <w:jc w:val="left"/>
               <w:rPr>
-                <w:rFonts w:hint="eastAsia" w:asciiTheme="majorEastAsia" w:hAnsiTheme="majorEastAsia" w:eastAsiaTheme="majorEastAsia" w:cstheme="majorEastAsia"/>
-                <w:b w:val="0"/>
-                <w:bCs w:val="0"/>
-                <w:color w:val="auto"/>
-                <w:sz w:val="20"/>
-                <w:szCs w:val="20"/>
-                <w:vertAlign w:val="baseline"/>
-              </w:rPr>
-            </w:pPr>
-            <w:r>
-              <w:rPr>
-                <w:rFonts w:hint="default" w:asciiTheme="majorEastAsia" w:hAnsiTheme="majorEastAsia" w:eastAsiaTheme="majorEastAsia" w:cstheme="majorEastAsia"/>
-                <w:b w:val="0"/>
-                <w:bCs w:val="0"/>
-                <w:color w:val="auto"/>
-                <w:sz w:val="20"/>
-                <w:szCs w:val="20"/>
-                <w:vertAlign w:val="baseline"/>
-              </w:rPr>
-              <w:t>Ouput</w:t>
-            </w:r>
-          </w:p>
-        </w:tc>
-        <w:tc>
-          <w:tcPr>
-            <w:tcW w:w="1150" w:type="dxa"/>
+                <w:rFonts w:hint="default" w:asciiTheme="majorEastAsia" w:hAnsiTheme="majorEastAsia" w:eastAsiaTheme="majorEastAsia" w:cstheme="majorEastAsia"/>
+                <w:b w:val="0"/>
+                <w:bCs w:val="0"/>
+                <w:color w:val="auto"/>
+                <w:sz w:val="20"/>
+                <w:szCs w:val="20"/>
+                <w:vertAlign w:val="baseline"/>
+              </w:rPr>
+            </w:pPr>
+            <w:r>
+              <w:rPr>
+                <w:rFonts w:hint="default" w:asciiTheme="majorEastAsia" w:hAnsiTheme="majorEastAsia" w:eastAsiaTheme="majorEastAsia" w:cstheme="majorEastAsia"/>
+                <w:b w:val="0"/>
+                <w:bCs w:val="0"/>
+                <w:color w:val="auto"/>
+                <w:sz w:val="20"/>
+                <w:szCs w:val="20"/>
+                <w:vertAlign w:val="baseline"/>
+              </w:rPr>
+              <w:t>Input</w:t>
+            </w:r>
+          </w:p>
+        </w:tc>
+        <w:tc>
+          <w:tcPr>
+            <w:tcW w:w="1368" w:type="dxa"/>
             <w:tcBorders>
               <w:tl2br w:val="nil"/>
               <w:tr2bl w:val="nil"/>
@@ -8383,25 +8325,13 @@
                 <w:szCs w:val="20"/>
                 <w:vertAlign w:val="baseline"/>
               </w:rPr>
-              <w:t>NMx</w:t>
-            </w:r>
-            <w:r>
-              <w:rPr>
-                <w:rFonts w:hint="default" w:asciiTheme="majorEastAsia" w:hAnsiTheme="majorEastAsia" w:eastAsiaTheme="majorEastAsia" w:cstheme="majorEastAsia"/>
-                <w:b w:val="0"/>
-                <w:bCs w:val="0"/>
-                <w:color w:val="auto"/>
-                <w:sz w:val="20"/>
-                <w:szCs w:val="20"/>
-                <w:vertAlign w:val="baseline"/>
-              </w:rPr>
-              <w:t>AW</w:t>
-            </w:r>
-          </w:p>
-        </w:tc>
-        <w:tc>
-          <w:tcPr>
-            <w:tcW w:w="4241" w:type="dxa"/>
+              <w:t>NMx2</w:t>
+            </w:r>
+          </w:p>
+        </w:tc>
+        <w:tc>
+          <w:tcPr>
+            <w:tcW w:w="3995" w:type="dxa"/>
             <w:tcBorders>
               <w:tl2br w:val="nil"/>
               <w:tr2bl w:val="nil"/>
@@ -8423,18 +8353,181 @@
                 <w:vertAlign w:val="baseline"/>
               </w:rPr>
             </w:pPr>
-            <w:r>
-              <w:rPr>
-                <w:rFonts w:hint="default" w:asciiTheme="majorEastAsia" w:hAnsiTheme="majorEastAsia" w:eastAsiaTheme="majorEastAsia" w:cstheme="majorEastAsia"/>
-                <w:b w:val="0"/>
-                <w:bCs w:val="0"/>
-                <w:color w:val="auto"/>
-                <w:sz w:val="20"/>
-                <w:szCs w:val="20"/>
-                <w:vertAlign w:val="baseline"/>
-              </w:rPr>
-              <w:t>Byte address of transfer</w:t>
-            </w:r>
+          </w:p>
+        </w:tc>
+      </w:tr>
+      <w:tr>
+        <w:tblPrEx>
+          <w:tblBorders>
+            <w:top w:val="single" w:color="auto" w:sz="4" w:space="0"/>
+            <w:left w:val="single" w:color="auto" w:sz="4" w:space="0"/>
+            <w:bottom w:val="single" w:color="auto" w:sz="4" w:space="0"/>
+            <w:right w:val="single" w:color="auto" w:sz="4" w:space="0"/>
+            <w:insideH w:val="single" w:color="auto" w:sz="4" w:space="0"/>
+            <w:insideV w:val="single" w:color="auto" w:sz="4" w:space="0"/>
+          </w:tblBorders>
+          <w:shd w:val="clear" w:color="auto" w:fill="auto"/>
+          <w:tblLayout w:type="fixed"/>
+          <w:tblCellMar>
+            <w:top w:w="0" w:type="dxa"/>
+            <w:left w:w="108" w:type="dxa"/>
+            <w:bottom w:w="0" w:type="dxa"/>
+            <w:right w:w="108" w:type="dxa"/>
+          </w:tblCellMar>
+        </w:tblPrEx>
+        <w:trPr>
+          <w:trHeight w:val="356" w:hRule="atLeast"/>
+        </w:trPr>
+        <w:tc>
+          <w:tcPr>
+            <w:tcW w:w="2319" w:type="dxa"/>
+            <w:tcBorders>
+              <w:tl2br w:val="nil"/>
+              <w:tr2bl w:val="nil"/>
+            </w:tcBorders>
+            <w:shd w:val="clear" w:color="auto" w:fill="auto"/>
+            <w:vAlign w:val="top"/>
+          </w:tcPr>
+          <w:p>
+            <w:pPr>
+              <w:widowControl w:val="0"/>
+              <w:jc w:val="left"/>
+              <w:rPr>
+                <w:rFonts w:hint="default" w:asciiTheme="majorEastAsia" w:hAnsiTheme="majorEastAsia" w:eastAsiaTheme="majorEastAsia" w:cstheme="majorEastAsia"/>
+                <w:b w:val="0"/>
+                <w:bCs w:val="0"/>
+                <w:color w:val="auto"/>
+                <w:sz w:val="20"/>
+                <w:szCs w:val="20"/>
+                <w:vertAlign w:val="baseline"/>
+              </w:rPr>
+            </w:pPr>
+            <w:r>
+              <w:rPr>
+                <w:rFonts w:hint="default" w:asciiTheme="majorEastAsia" w:hAnsiTheme="majorEastAsia" w:eastAsiaTheme="majorEastAsia" w:cstheme="majorEastAsia"/>
+                <w:b w:val="0"/>
+                <w:bCs w:val="0"/>
+                <w:color w:val="auto"/>
+                <w:sz w:val="20"/>
+                <w:szCs w:val="20"/>
+                <w:vertAlign w:val="baseline"/>
+              </w:rPr>
+              <w:t>mst_hwdata_</w:t>
+            </w:r>
+            <w:r>
+              <w:rPr>
+                <w:rFonts w:hint="default" w:asciiTheme="majorEastAsia" w:hAnsiTheme="majorEastAsia" w:eastAsiaTheme="majorEastAsia" w:cstheme="majorEastAsia"/>
+                <w:b w:val="0"/>
+                <w:bCs w:val="0"/>
+                <w:color w:val="auto"/>
+                <w:sz w:val="20"/>
+                <w:szCs w:val="20"/>
+                <w:vertAlign w:val="baseline"/>
+              </w:rPr>
+              <w:t>i</w:t>
+            </w:r>
+          </w:p>
+        </w:tc>
+        <w:tc>
+          <w:tcPr>
+            <w:tcW w:w="840" w:type="dxa"/>
+            <w:tcBorders>
+              <w:tl2br w:val="nil"/>
+              <w:tr2bl w:val="nil"/>
+            </w:tcBorders>
+            <w:shd w:val="clear" w:color="auto" w:fill="auto"/>
+            <w:vAlign w:val="top"/>
+          </w:tcPr>
+          <w:p>
+            <w:pPr>
+              <w:widowControl w:val="0"/>
+              <w:jc w:val="left"/>
+              <w:rPr>
+                <w:rFonts w:hint="default" w:asciiTheme="majorEastAsia" w:hAnsiTheme="majorEastAsia" w:eastAsiaTheme="majorEastAsia" w:cstheme="majorEastAsia"/>
+                <w:b w:val="0"/>
+                <w:bCs w:val="0"/>
+                <w:color w:val="auto"/>
+                <w:sz w:val="20"/>
+                <w:szCs w:val="20"/>
+                <w:vertAlign w:val="baseline"/>
+              </w:rPr>
+            </w:pPr>
+            <w:r>
+              <w:rPr>
+                <w:rFonts w:hint="default" w:asciiTheme="majorEastAsia" w:hAnsiTheme="majorEastAsia" w:eastAsiaTheme="majorEastAsia" w:cstheme="majorEastAsia"/>
+                <w:b w:val="0"/>
+                <w:bCs w:val="0"/>
+                <w:color w:val="auto"/>
+                <w:sz w:val="20"/>
+                <w:szCs w:val="20"/>
+                <w:vertAlign w:val="baseline"/>
+              </w:rPr>
+              <w:t>Input</w:t>
+            </w:r>
+          </w:p>
+        </w:tc>
+        <w:tc>
+          <w:tcPr>
+            <w:tcW w:w="1368" w:type="dxa"/>
+            <w:tcBorders>
+              <w:tl2br w:val="nil"/>
+              <w:tr2bl w:val="nil"/>
+            </w:tcBorders>
+            <w:shd w:val="clear" w:color="auto" w:fill="auto"/>
+            <w:vAlign w:val="top"/>
+          </w:tcPr>
+          <w:p>
+            <w:pPr>
+              <w:widowControl w:val="0"/>
+              <w:jc w:val="left"/>
+              <w:rPr>
+                <w:rFonts w:hint="eastAsia" w:asciiTheme="majorEastAsia" w:hAnsiTheme="majorEastAsia" w:eastAsiaTheme="majorEastAsia" w:cstheme="majorEastAsia"/>
+                <w:b w:val="0"/>
+                <w:bCs w:val="0"/>
+                <w:color w:val="auto"/>
+                <w:sz w:val="20"/>
+                <w:szCs w:val="20"/>
+                <w:vertAlign w:val="baseline"/>
+              </w:rPr>
+            </w:pPr>
+            <w:r>
+              <w:rPr>
+                <w:rFonts w:hint="default" w:asciiTheme="majorEastAsia" w:hAnsiTheme="majorEastAsia" w:eastAsiaTheme="majorEastAsia" w:cstheme="majorEastAsia"/>
+                <w:b w:val="0"/>
+                <w:bCs w:val="0"/>
+                <w:color w:val="auto"/>
+                <w:sz w:val="20"/>
+                <w:szCs w:val="20"/>
+                <w:vertAlign w:val="baseline"/>
+              </w:rPr>
+              <w:t>NMxDW</w:t>
+            </w:r>
+          </w:p>
+        </w:tc>
+        <w:tc>
+          <w:tcPr>
+            <w:tcW w:w="3995" w:type="dxa"/>
+            <w:tcBorders>
+              <w:tl2br w:val="nil"/>
+              <w:tr2bl w:val="nil"/>
+            </w:tcBorders>
+            <w:shd w:val="clear" w:color="auto" w:fill="auto"/>
+            <w:vAlign w:val="top"/>
+          </w:tcPr>
+          <w:p>
+            <w:pPr>
+              <w:widowControl w:val="0"/>
+              <w:jc w:val="left"/>
+              <w:rPr>
+                <w:rFonts w:hint="eastAsia" w:asciiTheme="majorEastAsia" w:hAnsiTheme="majorEastAsia" w:eastAsiaTheme="majorEastAsia" w:cstheme="majorEastAsia"/>
+                <w:b w:val="0"/>
+                <w:bCs w:val="0"/>
+                <w:color w:val="auto"/>
+                <w:sz w:val="20"/>
+                <w:szCs w:val="20"/>
+                <w:vertAlign w:val="baseline"/>
+              </w:rPr>
+            </w:pPr>
           </w:p>
         </w:tc>
       </w:tr>
@@ -8475,38 +8568,38 @@
               <w:widowControl w:val="0"/>
               <w:jc w:val="left"/>
               <w:rPr>
-                <w:rFonts w:hint="eastAsia" w:asciiTheme="majorEastAsia" w:hAnsiTheme="majorEastAsia" w:eastAsiaTheme="majorEastAsia" w:cstheme="majorEastAsia"/>
-                <w:b w:val="0"/>
-                <w:bCs w:val="0"/>
-                <w:color w:val="auto"/>
-                <w:sz w:val="20"/>
-                <w:szCs w:val="20"/>
-                <w:vertAlign w:val="baseline"/>
-              </w:rPr>
-            </w:pPr>
-            <w:r>
-              <w:rPr>
-                <w:rFonts w:hint="default" w:asciiTheme="majorEastAsia" w:hAnsiTheme="majorEastAsia" w:eastAsiaTheme="majorEastAsia" w:cstheme="majorEastAsia"/>
-                <w:b w:val="0"/>
-                <w:bCs w:val="0"/>
-                <w:color w:val="auto"/>
-                <w:sz w:val="20"/>
-                <w:szCs w:val="20"/>
-                <w:vertAlign w:val="baseline"/>
-              </w:rPr>
-              <w:t>mst_hburst</w:t>
-            </w:r>
-            <w:r>
-              <w:rPr>
-                <w:rFonts w:hint="default" w:asciiTheme="majorEastAsia" w:hAnsiTheme="majorEastAsia" w:eastAsiaTheme="majorEastAsia" w:cstheme="majorEastAsia"/>
-                <w:b w:val="0"/>
-                <w:bCs w:val="0"/>
-                <w:color w:val="auto"/>
-                <w:sz w:val="20"/>
-                <w:szCs w:val="20"/>
-                <w:vertAlign w:val="baseline"/>
-              </w:rPr>
-              <w:t>_o</w:t>
+                <w:rFonts w:hint="default" w:asciiTheme="majorEastAsia" w:hAnsiTheme="majorEastAsia" w:eastAsiaTheme="majorEastAsia" w:cstheme="majorEastAsia"/>
+                <w:b w:val="0"/>
+                <w:bCs w:val="0"/>
+                <w:color w:val="auto"/>
+                <w:sz w:val="20"/>
+                <w:szCs w:val="20"/>
+                <w:vertAlign w:val="baseline"/>
+              </w:rPr>
+            </w:pPr>
+            <w:r>
+              <w:rPr>
+                <w:rFonts w:hint="default" w:asciiTheme="majorEastAsia" w:hAnsiTheme="majorEastAsia" w:eastAsiaTheme="majorEastAsia" w:cstheme="majorEastAsia"/>
+                <w:b w:val="0"/>
+                <w:bCs w:val="0"/>
+                <w:color w:val="auto"/>
+                <w:sz w:val="20"/>
+                <w:szCs w:val="20"/>
+                <w:vertAlign w:val="baseline"/>
+              </w:rPr>
+              <w:t>mst_hwstrb_</w:t>
+            </w:r>
+            <w:r>
+              <w:rPr>
+                <w:rFonts w:hint="default" w:asciiTheme="majorEastAsia" w:hAnsiTheme="majorEastAsia" w:eastAsiaTheme="majorEastAsia" w:cstheme="majorEastAsia"/>
+                <w:b w:val="0"/>
+                <w:bCs w:val="0"/>
+                <w:color w:val="auto"/>
+                <w:sz w:val="20"/>
+                <w:szCs w:val="20"/>
+                <w:vertAlign w:val="baseline"/>
+              </w:rPr>
+              <w:t>i</w:t>
             </w:r>
           </w:p>
         </w:tc>
@@ -8544,13 +8637,13 @@
                 <w:szCs w:val="20"/>
                 <w:vertAlign w:val="baseline"/>
               </w:rPr>
-              <w:t>Ouput</w:t>
-            </w:r>
-          </w:p>
-        </w:tc>
-        <w:tc>
-          <w:tcPr>
-            <w:tcW w:w="1150" w:type="dxa"/>
+              <w:t>Input</w:t>
+            </w:r>
+          </w:p>
+        </w:tc>
+        <w:tc>
+          <w:tcPr>
+            <w:tcW w:w="1368" w:type="dxa"/>
             <w:tcBorders>
               <w:tl2br w:val="nil"/>
               <w:tr2bl w:val="nil"/>
@@ -8582,13 +8675,13 @@
                 <w:szCs w:val="20"/>
                 <w:vertAlign w:val="baseline"/>
               </w:rPr>
-              <w:t>NMx3</w:t>
-            </w:r>
-          </w:p>
-        </w:tc>
-        <w:tc>
-          <w:tcPr>
-            <w:tcW w:w="4241" w:type="dxa"/>
+              <w:t>NMx(DW/8)</w:t>
+            </w:r>
+          </w:p>
+        </w:tc>
+        <w:tc>
+          <w:tcPr>
+            <w:tcW w:w="3995" w:type="dxa"/>
             <w:tcBorders>
               <w:tl2br w:val="nil"/>
               <w:tr2bl w:val="nil"/>
@@ -8669,19 +8762,19 @@
                 <w:szCs w:val="20"/>
                 <w:vertAlign w:val="baseline"/>
               </w:rPr>
-              <w:t>mst_hsize</w:t>
-            </w:r>
-            <w:r>
-              <w:rPr>
-                <w:rFonts w:hint="default" w:asciiTheme="majorEastAsia" w:hAnsiTheme="majorEastAsia" w:eastAsiaTheme="majorEastAsia" w:cstheme="majorEastAsia"/>
-                <w:b w:val="0"/>
-                <w:bCs w:val="0"/>
-                <w:color w:val="auto"/>
-                <w:sz w:val="20"/>
-                <w:szCs w:val="20"/>
-                <w:vertAlign w:val="baseline"/>
-              </w:rPr>
-              <w:t>_o</w:t>
+              <w:t>mst_hwrite_</w:t>
+            </w:r>
+            <w:r>
+              <w:rPr>
+                <w:rFonts w:hint="default" w:asciiTheme="majorEastAsia" w:hAnsiTheme="majorEastAsia" w:eastAsiaTheme="majorEastAsia" w:cstheme="majorEastAsia"/>
+                <w:b w:val="0"/>
+                <w:bCs w:val="0"/>
+                <w:color w:val="auto"/>
+                <w:sz w:val="20"/>
+                <w:szCs w:val="20"/>
+                <w:vertAlign w:val="baseline"/>
+              </w:rPr>
+              <w:t>i</w:t>
             </w:r>
           </w:p>
         </w:tc>
@@ -8719,13 +8812,13 @@
                 <w:szCs w:val="20"/>
                 <w:vertAlign w:val="baseline"/>
               </w:rPr>
-              <w:t>Ouput</w:t>
-            </w:r>
-          </w:p>
-        </w:tc>
-        <w:tc>
-          <w:tcPr>
-            <w:tcW w:w="1150" w:type="dxa"/>
+              <w:t>Input</w:t>
+            </w:r>
+          </w:p>
+        </w:tc>
+        <w:tc>
+          <w:tcPr>
+            <w:tcW w:w="1368" w:type="dxa"/>
             <w:tcBorders>
               <w:tl2br w:val="nil"/>
               <w:tr2bl w:val="nil"/>
@@ -8747,11 +8840,23 @@
                 <w:vertAlign w:val="baseline"/>
               </w:rPr>
             </w:pPr>
-          </w:p>
-        </w:tc>
-        <w:tc>
-          <w:tcPr>
-            <w:tcW w:w="4241" w:type="dxa"/>
+            <w:r>
+              <w:rPr>
+                <w:rFonts w:hint="default" w:asciiTheme="majorEastAsia" w:hAnsiTheme="majorEastAsia" w:eastAsiaTheme="majorEastAsia" w:cstheme="majorEastAsia"/>
+                <w:b w:val="0"/>
+                <w:bCs w:val="0"/>
+                <w:color w:val="auto"/>
+                <w:sz w:val="20"/>
+                <w:szCs w:val="20"/>
+                <w:vertAlign w:val="baseline"/>
+              </w:rPr>
+              <w:t>NM</w:t>
+            </w:r>
+          </w:p>
+        </w:tc>
+        <w:tc>
+          <w:tcPr>
+            <w:tcW w:w="3995" w:type="dxa"/>
             <w:tcBorders>
               <w:tl2br w:val="nil"/>
               <w:tr2bl w:val="nil"/>
@@ -8832,19 +8937,19 @@
                 <w:szCs w:val="20"/>
                 <w:vertAlign w:val="baseline"/>
               </w:rPr>
-              <w:t>mst_htrans</w:t>
-            </w:r>
-            <w:r>
-              <w:rPr>
-                <w:rFonts w:hint="default" w:asciiTheme="majorEastAsia" w:hAnsiTheme="majorEastAsia" w:eastAsiaTheme="majorEastAsia" w:cstheme="majorEastAsia"/>
-                <w:b w:val="0"/>
-                <w:bCs w:val="0"/>
-                <w:color w:val="auto"/>
-                <w:sz w:val="20"/>
-                <w:szCs w:val="20"/>
-                <w:vertAlign w:val="baseline"/>
-              </w:rPr>
-              <w:t>_o</w:t>
+              <w:t>mst_hrdata_</w:t>
+            </w:r>
+            <w:r>
+              <w:rPr>
+                <w:rFonts w:hint="default" w:asciiTheme="majorEastAsia" w:hAnsiTheme="majorEastAsia" w:eastAsiaTheme="majorEastAsia" w:cstheme="majorEastAsia"/>
+                <w:b w:val="0"/>
+                <w:bCs w:val="0"/>
+                <w:color w:val="auto"/>
+                <w:sz w:val="20"/>
+                <w:szCs w:val="20"/>
+                <w:vertAlign w:val="baseline"/>
+              </w:rPr>
+              <w:t>o</w:t>
             </w:r>
           </w:p>
         </w:tc>
@@ -8888,196 +8993,46 @@
         </w:tc>
         <w:tc>
           <w:tcPr>
-            <w:tcW w:w="1150" w:type="dxa"/>
-            <w:tcBorders>
-              <w:tl2br w:val="nil"/>
-              <w:tr2bl w:val="nil"/>
-            </w:tcBorders>
-            <w:shd w:val="clear" w:color="auto" w:fill="auto"/>
-            <w:vAlign w:val="top"/>
-          </w:tcPr>
-          <w:p>
-            <w:pPr>
-              <w:widowControl w:val="0"/>
-              <w:jc w:val="left"/>
-              <w:rPr>
-                <w:rFonts w:hint="eastAsia" w:asciiTheme="majorEastAsia" w:hAnsiTheme="majorEastAsia" w:eastAsiaTheme="majorEastAsia" w:cstheme="majorEastAsia"/>
-                <w:b w:val="0"/>
-                <w:bCs w:val="0"/>
-                <w:color w:val="auto"/>
-                <w:sz w:val="20"/>
-                <w:szCs w:val="20"/>
-                <w:vertAlign w:val="baseline"/>
-              </w:rPr>
-            </w:pPr>
-          </w:p>
-        </w:tc>
-        <w:tc>
-          <w:tcPr>
-            <w:tcW w:w="4241" w:type="dxa"/>
-            <w:tcBorders>
-              <w:tl2br w:val="nil"/>
-              <w:tr2bl w:val="nil"/>
-            </w:tcBorders>
-            <w:shd w:val="clear" w:color="auto" w:fill="auto"/>
-            <w:vAlign w:val="top"/>
-          </w:tcPr>
-          <w:p>
-            <w:pPr>
-              <w:widowControl w:val="0"/>
-              <w:jc w:val="left"/>
-              <w:rPr>
-                <w:rFonts w:hint="eastAsia" w:asciiTheme="majorEastAsia" w:hAnsiTheme="majorEastAsia" w:eastAsiaTheme="majorEastAsia" w:cstheme="majorEastAsia"/>
-                <w:b w:val="0"/>
-                <w:bCs w:val="0"/>
-                <w:color w:val="auto"/>
-                <w:sz w:val="20"/>
-                <w:szCs w:val="20"/>
-                <w:vertAlign w:val="baseline"/>
-              </w:rPr>
-            </w:pPr>
-          </w:p>
-        </w:tc>
-      </w:tr>
-      <w:tr>
-        <w:tblPrEx>
-          <w:tblBorders>
-            <w:top w:val="single" w:color="auto" w:sz="4" w:space="0"/>
-            <w:left w:val="single" w:color="auto" w:sz="4" w:space="0"/>
-            <w:bottom w:val="single" w:color="auto" w:sz="4" w:space="0"/>
-            <w:right w:val="single" w:color="auto" w:sz="4" w:space="0"/>
-            <w:insideH w:val="single" w:color="auto" w:sz="4" w:space="0"/>
-            <w:insideV w:val="single" w:color="auto" w:sz="4" w:space="0"/>
-          </w:tblBorders>
-          <w:shd w:val="clear" w:color="auto" w:fill="auto"/>
-          <w:tblLayout w:type="fixed"/>
-          <w:tblCellMar>
-            <w:top w:w="0" w:type="dxa"/>
-            <w:left w:w="108" w:type="dxa"/>
-            <w:bottom w:w="0" w:type="dxa"/>
-            <w:right w:w="108" w:type="dxa"/>
-          </w:tblCellMar>
-        </w:tblPrEx>
-        <w:trPr>
-          <w:trHeight w:val="356" w:hRule="atLeast"/>
-        </w:trPr>
-        <w:tc>
-          <w:tcPr>
-            <w:tcW w:w="2319" w:type="dxa"/>
-            <w:tcBorders>
-              <w:tl2br w:val="nil"/>
-              <w:tr2bl w:val="nil"/>
-            </w:tcBorders>
-            <w:shd w:val="clear" w:color="auto" w:fill="auto"/>
-            <w:vAlign w:val="top"/>
-          </w:tcPr>
-          <w:p>
-            <w:pPr>
-              <w:widowControl w:val="0"/>
-              <w:jc w:val="left"/>
-              <w:rPr>
-                <w:rFonts w:hint="default" w:asciiTheme="majorEastAsia" w:hAnsiTheme="majorEastAsia" w:eastAsiaTheme="majorEastAsia" w:cstheme="majorEastAsia"/>
-                <w:b w:val="0"/>
-                <w:bCs w:val="0"/>
-                <w:color w:val="auto"/>
-                <w:sz w:val="20"/>
-                <w:szCs w:val="20"/>
-                <w:vertAlign w:val="baseline"/>
-              </w:rPr>
-            </w:pPr>
-            <w:r>
-              <w:rPr>
-                <w:rFonts w:hint="default" w:asciiTheme="majorEastAsia" w:hAnsiTheme="majorEastAsia" w:eastAsiaTheme="majorEastAsia" w:cstheme="majorEastAsia"/>
-                <w:b w:val="0"/>
-                <w:bCs w:val="0"/>
-                <w:color w:val="auto"/>
-                <w:sz w:val="20"/>
-                <w:szCs w:val="20"/>
-                <w:vertAlign w:val="baseline"/>
-              </w:rPr>
-              <w:t>mst_hwdata</w:t>
-            </w:r>
-            <w:r>
-              <w:rPr>
-                <w:rFonts w:hint="default" w:asciiTheme="majorEastAsia" w:hAnsiTheme="majorEastAsia" w:eastAsiaTheme="majorEastAsia" w:cstheme="majorEastAsia"/>
-                <w:b w:val="0"/>
-                <w:bCs w:val="0"/>
-                <w:color w:val="auto"/>
-                <w:sz w:val="20"/>
-                <w:szCs w:val="20"/>
-                <w:vertAlign w:val="baseline"/>
-              </w:rPr>
-              <w:t>_o</w:t>
-            </w:r>
-          </w:p>
-        </w:tc>
-        <w:tc>
-          <w:tcPr>
-            <w:tcW w:w="840" w:type="dxa"/>
-            <w:tcBorders>
-              <w:tl2br w:val="nil"/>
-              <w:tr2bl w:val="nil"/>
-            </w:tcBorders>
-            <w:shd w:val="clear" w:color="auto" w:fill="auto"/>
-            <w:vAlign w:val="top"/>
-          </w:tcPr>
-          <w:p>
-            <w:pPr>
-              <w:widowControl w:val="0"/>
-              <w:jc w:val="left"/>
-              <w:rPr>
-                <w:rFonts w:hint="default" w:asciiTheme="majorEastAsia" w:hAnsiTheme="majorEastAsia" w:eastAsiaTheme="majorEastAsia" w:cstheme="majorEastAsia"/>
-                <w:b w:val="0"/>
-                <w:bCs w:val="0"/>
-                <w:color w:val="auto"/>
-                <w:sz w:val="20"/>
-                <w:szCs w:val="20"/>
-                <w:vertAlign w:val="baseline"/>
-              </w:rPr>
-            </w:pPr>
-            <w:r>
-              <w:rPr>
-                <w:rFonts w:hint="default" w:asciiTheme="majorEastAsia" w:hAnsiTheme="majorEastAsia" w:eastAsiaTheme="majorEastAsia" w:cstheme="majorEastAsia"/>
-                <w:b w:val="0"/>
-                <w:bCs w:val="0"/>
-                <w:color w:val="auto"/>
-                <w:sz w:val="20"/>
-                <w:szCs w:val="20"/>
-                <w:vertAlign w:val="baseline"/>
-              </w:rPr>
-              <w:t>Ouput</w:t>
-            </w:r>
-          </w:p>
-        </w:tc>
-        <w:tc>
-          <w:tcPr>
-            <w:tcW w:w="1150" w:type="dxa"/>
-            <w:tcBorders>
-              <w:tl2br w:val="nil"/>
-              <w:tr2bl w:val="nil"/>
-            </w:tcBorders>
-            <w:shd w:val="clear" w:color="auto" w:fill="auto"/>
-            <w:vAlign w:val="top"/>
-          </w:tcPr>
-          <w:p>
-            <w:pPr>
-              <w:widowControl w:val="0"/>
-              <w:jc w:val="left"/>
-              <w:rPr>
-                <w:rFonts w:hint="eastAsia" w:asciiTheme="majorEastAsia" w:hAnsiTheme="majorEastAsia" w:eastAsiaTheme="majorEastAsia" w:cstheme="majorEastAsia"/>
-                <w:b w:val="0"/>
-                <w:bCs w:val="0"/>
-                <w:color w:val="auto"/>
-                <w:sz w:val="20"/>
-                <w:szCs w:val="20"/>
-                <w:vertAlign w:val="baseline"/>
-              </w:rPr>
-            </w:pPr>
-          </w:p>
-        </w:tc>
-        <w:tc>
-          <w:tcPr>
-            <w:tcW w:w="4241" w:type="dxa"/>
+            <w:tcW w:w="1368" w:type="dxa"/>
+            <w:tcBorders>
+              <w:tl2br w:val="nil"/>
+              <w:tr2bl w:val="nil"/>
+            </w:tcBorders>
+            <w:shd w:val="clear" w:color="auto" w:fill="auto"/>
+            <w:textDirection w:val="lrTbV"/>
+            <w:vAlign w:val="center"/>
+          </w:tcPr>
+          <w:p>
+            <w:pPr>
+              <w:widowControl w:val="0"/>
+              <w:jc w:val="both"/>
+              <w:rPr>
+                <w:rFonts w:hint="default" w:asciiTheme="majorEastAsia" w:hAnsiTheme="majorEastAsia" w:eastAsiaTheme="majorEastAsia" w:cstheme="majorEastAsia"/>
+                <w:b w:val="0"/>
+                <w:bCs w:val="0"/>
+                <w:color w:val="auto"/>
+                <w:sz w:val="20"/>
+                <w:szCs w:val="20"/>
+                <w:vertAlign w:val="baseline"/>
+              </w:rPr>
+            </w:pPr>
+            <w:r>
+              <w:rPr>
+                <w:rFonts w:hint="default" w:asciiTheme="majorEastAsia" w:hAnsiTheme="majorEastAsia" w:eastAsiaTheme="majorEastAsia" w:cstheme="majorEastAsia"/>
+                <w:b w:val="0"/>
+                <w:bCs w:val="0"/>
+                <w:color w:val="auto"/>
+                <w:sz w:val="20"/>
+                <w:szCs w:val="20"/>
+                <w:vertAlign w:val="baseline"/>
+              </w:rPr>
+              <w:t>NMxDW</w:t>
+            </w:r>
+          </w:p>
+        </w:tc>
+        <w:tc>
+          <w:tcPr>
+            <w:tcW w:w="3995" w:type="dxa"/>
             <w:tcBorders>
               <w:tl2br w:val="nil"/>
               <w:tr2bl w:val="nil"/>
@@ -9158,19 +9113,19 @@
                 <w:szCs w:val="20"/>
                 <w:vertAlign w:val="baseline"/>
               </w:rPr>
-              <w:t>mst_hwstrb</w:t>
-            </w:r>
-            <w:r>
-              <w:rPr>
-                <w:rFonts w:hint="default" w:asciiTheme="majorEastAsia" w:hAnsiTheme="majorEastAsia" w:eastAsiaTheme="majorEastAsia" w:cstheme="majorEastAsia"/>
-                <w:b w:val="0"/>
-                <w:bCs w:val="0"/>
-                <w:color w:val="auto"/>
-                <w:sz w:val="20"/>
-                <w:szCs w:val="20"/>
-                <w:vertAlign w:val="baseline"/>
-              </w:rPr>
-              <w:t>_o</w:t>
+              <w:t>mst_hresp_</w:t>
+            </w:r>
+            <w:r>
+              <w:rPr>
+                <w:rFonts w:hint="default" w:asciiTheme="majorEastAsia" w:hAnsiTheme="majorEastAsia" w:eastAsiaTheme="majorEastAsia" w:cstheme="majorEastAsia"/>
+                <w:b w:val="0"/>
+                <w:bCs w:val="0"/>
+                <w:color w:val="auto"/>
+                <w:sz w:val="20"/>
+                <w:szCs w:val="20"/>
+                <w:vertAlign w:val="baseline"/>
+              </w:rPr>
+              <w:t>o</w:t>
             </w:r>
           </w:p>
         </w:tc>
@@ -9214,33 +9169,46 @@
         </w:tc>
         <w:tc>
           <w:tcPr>
-            <w:tcW w:w="1150" w:type="dxa"/>
-            <w:tcBorders>
-              <w:tl2br w:val="nil"/>
-              <w:tr2bl w:val="nil"/>
-            </w:tcBorders>
-            <w:shd w:val="clear" w:color="auto" w:fill="auto"/>
-            <w:vAlign w:val="top"/>
-          </w:tcPr>
-          <w:p>
-            <w:pPr>
-              <w:widowControl w:val="0"/>
-              <w:jc w:val="left"/>
-              <w:rPr>
-                <w:rFonts w:hint="eastAsia" w:asciiTheme="majorEastAsia" w:hAnsiTheme="majorEastAsia" w:eastAsiaTheme="majorEastAsia" w:cstheme="majorEastAsia"/>
-                <w:b w:val="0"/>
-                <w:bCs w:val="0"/>
-                <w:color w:val="auto"/>
-                <w:sz w:val="20"/>
-                <w:szCs w:val="20"/>
-                <w:vertAlign w:val="baseline"/>
-              </w:rPr>
-            </w:pPr>
-          </w:p>
-        </w:tc>
-        <w:tc>
-          <w:tcPr>
-            <w:tcW w:w="4241" w:type="dxa"/>
+            <w:tcW w:w="1368" w:type="dxa"/>
+            <w:tcBorders>
+              <w:tl2br w:val="nil"/>
+              <w:tr2bl w:val="nil"/>
+            </w:tcBorders>
+            <w:shd w:val="clear" w:color="auto" w:fill="auto"/>
+            <w:textDirection w:val="lrTbV"/>
+            <w:vAlign w:val="center"/>
+          </w:tcPr>
+          <w:p>
+            <w:pPr>
+              <w:widowControl w:val="0"/>
+              <w:jc w:val="both"/>
+              <w:rPr>
+                <w:rFonts w:hint="default" w:asciiTheme="majorEastAsia" w:hAnsiTheme="majorEastAsia" w:eastAsiaTheme="majorEastAsia" w:cstheme="majorEastAsia"/>
+                <w:b w:val="0"/>
+                <w:bCs w:val="0"/>
+                <w:color w:val="auto"/>
+                <w:sz w:val="20"/>
+                <w:szCs w:val="20"/>
+                <w:vertAlign w:val="baseline"/>
+              </w:rPr>
+            </w:pPr>
+            <w:r>
+              <w:rPr>
+                <w:rFonts w:hint="default" w:asciiTheme="majorEastAsia" w:hAnsiTheme="majorEastAsia" w:eastAsiaTheme="majorEastAsia" w:cstheme="majorEastAsia"/>
+                <w:b w:val="0"/>
+                <w:bCs w:val="0"/>
+                <w:color w:val="auto"/>
+                <w:sz w:val="20"/>
+                <w:szCs w:val="20"/>
+                <w:vertAlign w:val="baseline"/>
+              </w:rPr>
+              <w:t>NM</w:t>
+            </w:r>
+          </w:p>
+        </w:tc>
+        <w:tc>
+          <w:tcPr>
+            <w:tcW w:w="3995" w:type="dxa"/>
             <w:tcBorders>
               <w:tl2br w:val="nil"/>
               <w:tr2bl w:val="nil"/>
@@ -9321,19 +9289,19 @@
                 <w:szCs w:val="20"/>
                 <w:vertAlign w:val="baseline"/>
               </w:rPr>
-              <w:t>mst_hwrite</w:t>
-            </w:r>
-            <w:r>
-              <w:rPr>
-                <w:rFonts w:hint="default" w:asciiTheme="majorEastAsia" w:hAnsiTheme="majorEastAsia" w:eastAsiaTheme="majorEastAsia" w:cstheme="majorEastAsia"/>
-                <w:b w:val="0"/>
-                <w:bCs w:val="0"/>
-                <w:color w:val="auto"/>
-                <w:sz w:val="20"/>
-                <w:szCs w:val="20"/>
-                <w:vertAlign w:val="baseline"/>
-              </w:rPr>
-              <w:t>_o</w:t>
+              <w:t>mst_hready_</w:t>
+            </w:r>
+            <w:r>
+              <w:rPr>
+                <w:rFonts w:hint="default" w:asciiTheme="majorEastAsia" w:hAnsiTheme="majorEastAsia" w:eastAsiaTheme="majorEastAsia" w:cstheme="majorEastAsia"/>
+                <w:b w:val="0"/>
+                <w:bCs w:val="0"/>
+                <w:color w:val="auto"/>
+                <w:sz w:val="20"/>
+                <w:szCs w:val="20"/>
+                <w:vertAlign w:val="baseline"/>
+              </w:rPr>
+              <w:t>o</w:t>
             </w:r>
           </w:p>
         </w:tc>
@@ -9377,33 +9345,46 @@
         </w:tc>
         <w:tc>
           <w:tcPr>
-            <w:tcW w:w="1150" w:type="dxa"/>
-            <w:tcBorders>
-              <w:tl2br w:val="nil"/>
-              <w:tr2bl w:val="nil"/>
-            </w:tcBorders>
-            <w:shd w:val="clear" w:color="auto" w:fill="auto"/>
-            <w:vAlign w:val="top"/>
-          </w:tcPr>
-          <w:p>
-            <w:pPr>
-              <w:widowControl w:val="0"/>
-              <w:jc w:val="left"/>
-              <w:rPr>
-                <w:rFonts w:hint="eastAsia" w:asciiTheme="majorEastAsia" w:hAnsiTheme="majorEastAsia" w:eastAsiaTheme="majorEastAsia" w:cstheme="majorEastAsia"/>
-                <w:b w:val="0"/>
-                <w:bCs w:val="0"/>
-                <w:color w:val="auto"/>
-                <w:sz w:val="20"/>
-                <w:szCs w:val="20"/>
-                <w:vertAlign w:val="baseline"/>
-              </w:rPr>
-            </w:pPr>
-          </w:p>
-        </w:tc>
-        <w:tc>
-          <w:tcPr>
-            <w:tcW w:w="4241" w:type="dxa"/>
+            <w:tcW w:w="1368" w:type="dxa"/>
+            <w:tcBorders>
+              <w:tl2br w:val="nil"/>
+              <w:tr2bl w:val="nil"/>
+            </w:tcBorders>
+            <w:shd w:val="clear" w:color="auto" w:fill="auto"/>
+            <w:textDirection w:val="lrTbV"/>
+            <w:vAlign w:val="center"/>
+          </w:tcPr>
+          <w:p>
+            <w:pPr>
+              <w:widowControl w:val="0"/>
+              <w:jc w:val="both"/>
+              <w:rPr>
+                <w:rFonts w:hint="default" w:asciiTheme="majorEastAsia" w:hAnsiTheme="majorEastAsia" w:eastAsiaTheme="majorEastAsia" w:cstheme="majorEastAsia"/>
+                <w:b w:val="0"/>
+                <w:bCs w:val="0"/>
+                <w:color w:val="auto"/>
+                <w:sz w:val="20"/>
+                <w:szCs w:val="20"/>
+                <w:vertAlign w:val="baseline"/>
+              </w:rPr>
+            </w:pPr>
+            <w:r>
+              <w:rPr>
+                <w:rFonts w:hint="default" w:asciiTheme="majorEastAsia" w:hAnsiTheme="majorEastAsia" w:eastAsiaTheme="majorEastAsia" w:cstheme="majorEastAsia"/>
+                <w:b w:val="0"/>
+                <w:bCs w:val="0"/>
+                <w:color w:val="auto"/>
+                <w:sz w:val="20"/>
+                <w:szCs w:val="20"/>
+                <w:vertAlign w:val="baseline"/>
+              </w:rPr>
+              <w:t>NM</w:t>
+            </w:r>
+          </w:p>
+        </w:tc>
+        <w:tc>
+          <w:tcPr>
+            <w:tcW w:w="3995" w:type="dxa"/>
             <w:tcBorders>
               <w:tl2br w:val="nil"/>
               <w:tr2bl w:val="nil"/>
@@ -9452,7 +9433,7 @@
         </w:trPr>
         <w:tc>
           <w:tcPr>
-            <w:tcW w:w="8550" w:type="dxa"/>
+            <w:tcW w:w="8522" w:type="dxa"/>
             <w:gridSpan w:val="4"/>
             <w:tcBorders>
               <w:tl2br w:val="nil"/>
@@ -9486,7 +9467,7 @@
                 <w:szCs w:val="20"/>
                 <w:vertAlign w:val="baseline"/>
               </w:rPr>
-              <w:t>AHB Slave side ---------------------------------------------------------------------------------------------------</w:t>
+              <w:t xml:space="preserve">AHB </w:t>
             </w:r>
             <w:r>
               <w:rPr>
@@ -9498,7 +9479,43 @@
                 <w:szCs w:val="20"/>
                 <w:vertAlign w:val="baseline"/>
               </w:rPr>
-              <w:t>-</w:t>
+              <w:t>Slave</w:t>
+            </w:r>
+            <w:r>
+              <w:rPr>
+                <w:rFonts w:hint="default" w:asciiTheme="majorEastAsia" w:hAnsiTheme="majorEastAsia" w:eastAsiaTheme="majorEastAsia" w:cstheme="majorEastAsia"/>
+                <w:b/>
+                <w:bCs/>
+                <w:color w:val="auto"/>
+                <w:sz w:val="20"/>
+                <w:szCs w:val="20"/>
+                <w:vertAlign w:val="baseline"/>
+              </w:rPr>
+              <w:t xml:space="preserve"> side -</w:t>
+            </w:r>
+            <w:r>
+              <w:rPr>
+                <w:rFonts w:hint="default" w:asciiTheme="majorEastAsia" w:hAnsiTheme="majorEastAsia" w:eastAsiaTheme="majorEastAsia" w:cstheme="majorEastAsia"/>
+                <w:b/>
+                <w:bCs/>
+                <w:color w:val="auto"/>
+                <w:sz w:val="20"/>
+                <w:szCs w:val="20"/>
+                <w:vertAlign w:val="baseline"/>
+              </w:rPr>
+              <w:t>--</w:t>
+            </w:r>
+            <w:r>
+              <w:rPr>
+                <w:rFonts w:hint="default" w:asciiTheme="majorEastAsia" w:hAnsiTheme="majorEastAsia" w:eastAsiaTheme="majorEastAsia" w:cstheme="majorEastAsia"/>
+                <w:b/>
+                <w:bCs/>
+                <w:color w:val="auto"/>
+                <w:sz w:val="20"/>
+                <w:szCs w:val="20"/>
+                <w:vertAlign w:val="baseline"/>
+              </w:rPr>
+              <w:t>-------------------------------------------------------------------------------------------------</w:t>
             </w:r>
           </w:p>
         </w:tc>
@@ -9540,38 +9557,38 @@
               <w:widowControl w:val="0"/>
               <w:jc w:val="left"/>
               <w:rPr>
-                <w:rFonts w:hint="eastAsia" w:asciiTheme="majorEastAsia" w:hAnsiTheme="majorEastAsia" w:eastAsiaTheme="majorEastAsia" w:cstheme="majorEastAsia"/>
-                <w:b w:val="0"/>
-                <w:bCs w:val="0"/>
-                <w:color w:val="auto"/>
-                <w:sz w:val="20"/>
-                <w:szCs w:val="20"/>
-                <w:vertAlign w:val="baseline"/>
-              </w:rPr>
-            </w:pPr>
-            <w:r>
-              <w:rPr>
-                <w:rFonts w:hint="default" w:asciiTheme="majorEastAsia" w:hAnsiTheme="majorEastAsia" w:eastAsiaTheme="majorEastAsia" w:cstheme="majorEastAsia"/>
-                <w:b w:val="0"/>
-                <w:bCs w:val="0"/>
-                <w:color w:val="auto"/>
-                <w:sz w:val="20"/>
-                <w:szCs w:val="20"/>
-                <w:vertAlign w:val="baseline"/>
-              </w:rPr>
-              <w:t>slv_haddr</w:t>
-            </w:r>
-            <w:r>
-              <w:rPr>
-                <w:rFonts w:hint="default" w:asciiTheme="majorEastAsia" w:hAnsiTheme="majorEastAsia" w:eastAsiaTheme="majorEastAsia" w:cstheme="majorEastAsia"/>
-                <w:b w:val="0"/>
-                <w:bCs w:val="0"/>
-                <w:color w:val="auto"/>
-                <w:sz w:val="20"/>
-                <w:szCs w:val="20"/>
-                <w:vertAlign w:val="baseline"/>
-              </w:rPr>
-              <w:t>_i</w:t>
+                <w:rFonts w:hint="default" w:asciiTheme="majorEastAsia" w:hAnsiTheme="majorEastAsia" w:eastAsiaTheme="majorEastAsia" w:cstheme="majorEastAsia"/>
+                <w:b w:val="0"/>
+                <w:bCs w:val="0"/>
+                <w:color w:val="auto"/>
+                <w:sz w:val="20"/>
+                <w:szCs w:val="20"/>
+                <w:vertAlign w:val="baseline"/>
+              </w:rPr>
+            </w:pPr>
+            <w:r>
+              <w:rPr>
+                <w:rFonts w:hint="default" w:asciiTheme="majorEastAsia" w:hAnsiTheme="majorEastAsia" w:eastAsiaTheme="majorEastAsia" w:cstheme="majorEastAsia"/>
+                <w:b w:val="0"/>
+                <w:bCs w:val="0"/>
+                <w:color w:val="auto"/>
+                <w:sz w:val="20"/>
+                <w:szCs w:val="20"/>
+                <w:vertAlign w:val="baseline"/>
+              </w:rPr>
+              <w:t>slv_hrdata_</w:t>
+            </w:r>
+            <w:r>
+              <w:rPr>
+                <w:rFonts w:hint="default" w:asciiTheme="majorEastAsia" w:hAnsiTheme="majorEastAsia" w:eastAsiaTheme="majorEastAsia" w:cstheme="majorEastAsia"/>
+                <w:b w:val="0"/>
+                <w:bCs w:val="0"/>
+                <w:color w:val="auto"/>
+                <w:sz w:val="20"/>
+                <w:szCs w:val="20"/>
+                <w:vertAlign w:val="baseline"/>
+              </w:rPr>
+              <w:t>i</w:t>
             </w:r>
           </w:p>
         </w:tc>
@@ -9615,34 +9632,45 @@
         </w:tc>
         <w:tc>
           <w:tcPr>
-            <w:tcW w:w="1150" w:type="dxa"/>
-            <w:tcBorders>
-              <w:tl2br w:val="nil"/>
-              <w:tr2bl w:val="nil"/>
-            </w:tcBorders>
-            <w:shd w:val="clear" w:color="auto" w:fill="auto"/>
-            <w:textDirection w:val="lrTbV"/>
-            <w:vAlign w:val="center"/>
-          </w:tcPr>
-          <w:p>
-            <w:pPr>
-              <w:widowControl w:val="0"/>
-              <w:jc w:val="both"/>
-              <w:rPr>
-                <w:rFonts w:hint="eastAsia" w:asciiTheme="majorEastAsia" w:hAnsiTheme="majorEastAsia" w:eastAsiaTheme="majorEastAsia" w:cstheme="majorEastAsia"/>
-                <w:b w:val="0"/>
-                <w:bCs w:val="0"/>
-                <w:color w:val="auto"/>
-                <w:sz w:val="20"/>
-                <w:szCs w:val="20"/>
-                <w:vertAlign w:val="baseline"/>
-              </w:rPr>
-            </w:pPr>
-          </w:p>
-        </w:tc>
-        <w:tc>
-          <w:tcPr>
-            <w:tcW w:w="4241" w:type="dxa"/>
+            <w:tcW w:w="1368" w:type="dxa"/>
+            <w:tcBorders>
+              <w:tl2br w:val="nil"/>
+              <w:tr2bl w:val="nil"/>
+            </w:tcBorders>
+            <w:shd w:val="clear" w:color="auto" w:fill="auto"/>
+            <w:vAlign w:val="top"/>
+          </w:tcPr>
+          <w:p>
+            <w:pPr>
+              <w:widowControl w:val="0"/>
+              <w:jc w:val="left"/>
+              <w:rPr>
+                <w:rFonts w:hint="eastAsia" w:asciiTheme="majorEastAsia" w:hAnsiTheme="majorEastAsia" w:eastAsiaTheme="majorEastAsia" w:cstheme="majorEastAsia"/>
+                <w:b w:val="0"/>
+                <w:bCs w:val="0"/>
+                <w:color w:val="auto"/>
+                <w:sz w:val="20"/>
+                <w:szCs w:val="20"/>
+                <w:vertAlign w:val="baseline"/>
+              </w:rPr>
+            </w:pPr>
+            <w:r>
+              <w:rPr>
+                <w:rFonts w:hint="default" w:asciiTheme="majorEastAsia" w:hAnsiTheme="majorEastAsia" w:eastAsiaTheme="majorEastAsia" w:cstheme="majorEastAsia"/>
+                <w:b w:val="0"/>
+                <w:bCs w:val="0"/>
+                <w:color w:val="auto"/>
+                <w:sz w:val="20"/>
+                <w:szCs w:val="20"/>
+                <w:vertAlign w:val="baseline"/>
+              </w:rPr>
+              <w:t>NSxDW</w:t>
+            </w:r>
+          </w:p>
+        </w:tc>
+        <w:tc>
+          <w:tcPr>
+            <w:tcW w:w="3995" w:type="dxa"/>
             <w:tcBorders>
               <w:tl2br w:val="nil"/>
               <w:tr2bl w:val="nil"/>
@@ -9704,38 +9732,38 @@
               <w:widowControl w:val="0"/>
               <w:jc w:val="left"/>
               <w:rPr>
-                <w:rFonts w:hint="eastAsia" w:asciiTheme="majorEastAsia" w:hAnsiTheme="majorEastAsia" w:eastAsiaTheme="majorEastAsia" w:cstheme="majorEastAsia"/>
-                <w:b w:val="0"/>
-                <w:bCs w:val="0"/>
-                <w:color w:val="auto"/>
-                <w:sz w:val="20"/>
-                <w:szCs w:val="20"/>
-                <w:vertAlign w:val="baseline"/>
-              </w:rPr>
-            </w:pPr>
-            <w:r>
-              <w:rPr>
-                <w:rFonts w:hint="default" w:asciiTheme="majorEastAsia" w:hAnsiTheme="majorEastAsia" w:eastAsiaTheme="majorEastAsia" w:cstheme="majorEastAsia"/>
-                <w:b w:val="0"/>
-                <w:bCs w:val="0"/>
-                <w:color w:val="auto"/>
-                <w:sz w:val="20"/>
-                <w:szCs w:val="20"/>
-                <w:vertAlign w:val="baseline"/>
-              </w:rPr>
-              <w:t>slv_hburst</w:t>
-            </w:r>
-            <w:r>
-              <w:rPr>
-                <w:rFonts w:hint="default" w:asciiTheme="majorEastAsia" w:hAnsiTheme="majorEastAsia" w:eastAsiaTheme="majorEastAsia" w:cstheme="majorEastAsia"/>
-                <w:b w:val="0"/>
-                <w:bCs w:val="0"/>
-                <w:color w:val="auto"/>
-                <w:sz w:val="20"/>
-                <w:szCs w:val="20"/>
-                <w:vertAlign w:val="baseline"/>
-              </w:rPr>
-              <w:t>_i</w:t>
+                <w:rFonts w:hint="default" w:asciiTheme="majorEastAsia" w:hAnsiTheme="majorEastAsia" w:eastAsiaTheme="majorEastAsia" w:cstheme="majorEastAsia"/>
+                <w:b w:val="0"/>
+                <w:bCs w:val="0"/>
+                <w:color w:val="auto"/>
+                <w:sz w:val="20"/>
+                <w:szCs w:val="20"/>
+                <w:vertAlign w:val="baseline"/>
+              </w:rPr>
+            </w:pPr>
+            <w:r>
+              <w:rPr>
+                <w:rFonts w:hint="default" w:asciiTheme="majorEastAsia" w:hAnsiTheme="majorEastAsia" w:eastAsiaTheme="majorEastAsia" w:cstheme="majorEastAsia"/>
+                <w:b w:val="0"/>
+                <w:bCs w:val="0"/>
+                <w:color w:val="auto"/>
+                <w:sz w:val="20"/>
+                <w:szCs w:val="20"/>
+                <w:vertAlign w:val="baseline"/>
+              </w:rPr>
+              <w:t>slv_hresp_</w:t>
+            </w:r>
+            <w:r>
+              <w:rPr>
+                <w:rFonts w:hint="default" w:asciiTheme="majorEastAsia" w:hAnsiTheme="majorEastAsia" w:eastAsiaTheme="majorEastAsia" w:cstheme="majorEastAsia"/>
+                <w:b w:val="0"/>
+                <w:bCs w:val="0"/>
+                <w:color w:val="auto"/>
+                <w:sz w:val="20"/>
+                <w:szCs w:val="20"/>
+                <w:vertAlign w:val="baseline"/>
+              </w:rPr>
+              <w:t>i</w:t>
             </w:r>
           </w:p>
         </w:tc>
@@ -9779,34 +9807,45 @@
         </w:tc>
         <w:tc>
           <w:tcPr>
-            <w:tcW w:w="1150" w:type="dxa"/>
-            <w:tcBorders>
-              <w:tl2br w:val="nil"/>
-              <w:tr2bl w:val="nil"/>
-            </w:tcBorders>
-            <w:shd w:val="clear" w:color="auto" w:fill="auto"/>
-            <w:textDirection w:val="lrTbV"/>
-            <w:vAlign w:val="center"/>
-          </w:tcPr>
-          <w:p>
-            <w:pPr>
-              <w:widowControl w:val="0"/>
-              <w:jc w:val="both"/>
-              <w:rPr>
-                <w:rFonts w:hint="eastAsia" w:asciiTheme="majorEastAsia" w:hAnsiTheme="majorEastAsia" w:eastAsiaTheme="majorEastAsia" w:cstheme="majorEastAsia"/>
-                <w:b w:val="0"/>
-                <w:bCs w:val="0"/>
-                <w:color w:val="auto"/>
-                <w:sz w:val="20"/>
-                <w:szCs w:val="20"/>
-                <w:vertAlign w:val="baseline"/>
-              </w:rPr>
-            </w:pPr>
-          </w:p>
-        </w:tc>
-        <w:tc>
-          <w:tcPr>
-            <w:tcW w:w="4241" w:type="dxa"/>
+            <w:tcW w:w="1368" w:type="dxa"/>
+            <w:tcBorders>
+              <w:tl2br w:val="nil"/>
+              <w:tr2bl w:val="nil"/>
+            </w:tcBorders>
+            <w:shd w:val="clear" w:color="auto" w:fill="auto"/>
+            <w:vAlign w:val="top"/>
+          </w:tcPr>
+          <w:p>
+            <w:pPr>
+              <w:widowControl w:val="0"/>
+              <w:jc w:val="left"/>
+              <w:rPr>
+                <w:rFonts w:hint="eastAsia" w:asciiTheme="majorEastAsia" w:hAnsiTheme="majorEastAsia" w:eastAsiaTheme="majorEastAsia" w:cstheme="majorEastAsia"/>
+                <w:b w:val="0"/>
+                <w:bCs w:val="0"/>
+                <w:color w:val="auto"/>
+                <w:sz w:val="20"/>
+                <w:szCs w:val="20"/>
+                <w:vertAlign w:val="baseline"/>
+              </w:rPr>
+            </w:pPr>
+            <w:r>
+              <w:rPr>
+                <w:rFonts w:hint="default" w:asciiTheme="majorEastAsia" w:hAnsiTheme="majorEastAsia" w:eastAsiaTheme="majorEastAsia" w:cstheme="majorEastAsia"/>
+                <w:b w:val="0"/>
+                <w:bCs w:val="0"/>
+                <w:color w:val="auto"/>
+                <w:sz w:val="20"/>
+                <w:szCs w:val="20"/>
+                <w:vertAlign w:val="baseline"/>
+              </w:rPr>
+              <w:t>NS</w:t>
+            </w:r>
+          </w:p>
+        </w:tc>
+        <w:tc>
+          <w:tcPr>
+            <w:tcW w:w="3995" w:type="dxa"/>
             <w:tcBorders>
               <w:tl2br w:val="nil"/>
               <w:tr2bl w:val="nil"/>
@@ -9868,38 +9907,38 @@
               <w:widowControl w:val="0"/>
               <w:jc w:val="left"/>
               <w:rPr>
-                <w:rFonts w:hint="eastAsia" w:asciiTheme="majorEastAsia" w:hAnsiTheme="majorEastAsia" w:eastAsiaTheme="majorEastAsia" w:cstheme="majorEastAsia"/>
-                <w:b w:val="0"/>
-                <w:bCs w:val="0"/>
-                <w:color w:val="auto"/>
-                <w:sz w:val="20"/>
-                <w:szCs w:val="20"/>
-                <w:vertAlign w:val="baseline"/>
-              </w:rPr>
-            </w:pPr>
-            <w:r>
-              <w:rPr>
-                <w:rFonts w:hint="default" w:asciiTheme="majorEastAsia" w:hAnsiTheme="majorEastAsia" w:eastAsiaTheme="majorEastAsia" w:cstheme="majorEastAsia"/>
-                <w:b w:val="0"/>
-                <w:bCs w:val="0"/>
-                <w:color w:val="auto"/>
-                <w:sz w:val="20"/>
-                <w:szCs w:val="20"/>
-                <w:vertAlign w:val="baseline"/>
-              </w:rPr>
-              <w:t>slv_hsize</w:t>
-            </w:r>
-            <w:r>
-              <w:rPr>
-                <w:rFonts w:hint="default" w:asciiTheme="majorEastAsia" w:hAnsiTheme="majorEastAsia" w:eastAsiaTheme="majorEastAsia" w:cstheme="majorEastAsia"/>
-                <w:b w:val="0"/>
-                <w:bCs w:val="0"/>
-                <w:color w:val="auto"/>
-                <w:sz w:val="20"/>
-                <w:szCs w:val="20"/>
-                <w:vertAlign w:val="baseline"/>
-              </w:rPr>
-              <w:t>_i</w:t>
+                <w:rFonts w:hint="default" w:asciiTheme="majorEastAsia" w:hAnsiTheme="majorEastAsia" w:eastAsiaTheme="majorEastAsia" w:cstheme="majorEastAsia"/>
+                <w:b w:val="0"/>
+                <w:bCs w:val="0"/>
+                <w:color w:val="auto"/>
+                <w:sz w:val="20"/>
+                <w:szCs w:val="20"/>
+                <w:vertAlign w:val="baseline"/>
+              </w:rPr>
+            </w:pPr>
+            <w:r>
+              <w:rPr>
+                <w:rFonts w:hint="default" w:asciiTheme="majorEastAsia" w:hAnsiTheme="majorEastAsia" w:eastAsiaTheme="majorEastAsia" w:cstheme="majorEastAsia"/>
+                <w:b w:val="0"/>
+                <w:bCs w:val="0"/>
+                <w:color w:val="auto"/>
+                <w:sz w:val="20"/>
+                <w:szCs w:val="20"/>
+                <w:vertAlign w:val="baseline"/>
+              </w:rPr>
+              <w:t>slv_hreadyout_</w:t>
+            </w:r>
+            <w:r>
+              <w:rPr>
+                <w:rFonts w:hint="default" w:asciiTheme="majorEastAsia" w:hAnsiTheme="majorEastAsia" w:eastAsiaTheme="majorEastAsia" w:cstheme="majorEastAsia"/>
+                <w:b w:val="0"/>
+                <w:bCs w:val="0"/>
+                <w:color w:val="auto"/>
+                <w:sz w:val="20"/>
+                <w:szCs w:val="20"/>
+                <w:vertAlign w:val="baseline"/>
+              </w:rPr>
+              <w:t>i</w:t>
             </w:r>
           </w:p>
         </w:tc>
@@ -9943,34 +9982,45 @@
         </w:tc>
         <w:tc>
           <w:tcPr>
-            <w:tcW w:w="1150" w:type="dxa"/>
-            <w:tcBorders>
-              <w:tl2br w:val="nil"/>
-              <w:tr2bl w:val="nil"/>
-            </w:tcBorders>
-            <w:shd w:val="clear" w:color="auto" w:fill="auto"/>
-            <w:textDirection w:val="lrTbV"/>
-            <w:vAlign w:val="center"/>
-          </w:tcPr>
-          <w:p>
-            <w:pPr>
-              <w:widowControl w:val="0"/>
-              <w:jc w:val="both"/>
-              <w:rPr>
-                <w:rFonts w:hint="eastAsia" w:asciiTheme="majorEastAsia" w:hAnsiTheme="majorEastAsia" w:eastAsiaTheme="majorEastAsia" w:cstheme="majorEastAsia"/>
-                <w:b w:val="0"/>
-                <w:bCs w:val="0"/>
-                <w:color w:val="auto"/>
-                <w:sz w:val="20"/>
-                <w:szCs w:val="20"/>
-                <w:vertAlign w:val="baseline"/>
-              </w:rPr>
-            </w:pPr>
-          </w:p>
-        </w:tc>
-        <w:tc>
-          <w:tcPr>
-            <w:tcW w:w="4241" w:type="dxa"/>
+            <w:tcW w:w="1368" w:type="dxa"/>
+            <w:tcBorders>
+              <w:tl2br w:val="nil"/>
+              <w:tr2bl w:val="nil"/>
+            </w:tcBorders>
+            <w:shd w:val="clear" w:color="auto" w:fill="auto"/>
+            <w:vAlign w:val="top"/>
+          </w:tcPr>
+          <w:p>
+            <w:pPr>
+              <w:widowControl w:val="0"/>
+              <w:jc w:val="left"/>
+              <w:rPr>
+                <w:rFonts w:hint="eastAsia" w:asciiTheme="majorEastAsia" w:hAnsiTheme="majorEastAsia" w:eastAsiaTheme="majorEastAsia" w:cstheme="majorEastAsia"/>
+                <w:b w:val="0"/>
+                <w:bCs w:val="0"/>
+                <w:color w:val="auto"/>
+                <w:sz w:val="20"/>
+                <w:szCs w:val="20"/>
+                <w:vertAlign w:val="baseline"/>
+              </w:rPr>
+            </w:pPr>
+            <w:r>
+              <w:rPr>
+                <w:rFonts w:hint="default" w:asciiTheme="majorEastAsia" w:hAnsiTheme="majorEastAsia" w:eastAsiaTheme="majorEastAsia" w:cstheme="majorEastAsia"/>
+                <w:b w:val="0"/>
+                <w:bCs w:val="0"/>
+                <w:color w:val="auto"/>
+                <w:sz w:val="20"/>
+                <w:szCs w:val="20"/>
+                <w:vertAlign w:val="baseline"/>
+              </w:rPr>
+              <w:t>NS</w:t>
+            </w:r>
+          </w:p>
+        </w:tc>
+        <w:tc>
+          <w:tcPr>
+            <w:tcW w:w="3995" w:type="dxa"/>
             <w:tcBorders>
               <w:tl2br w:val="nil"/>
               <w:tr2bl w:val="nil"/>
@@ -10051,19 +10101,19 @@
                 <w:szCs w:val="20"/>
                 <w:vertAlign w:val="baseline"/>
               </w:rPr>
-              <w:t>slv_htrans</w:t>
-            </w:r>
-            <w:r>
-              <w:rPr>
-                <w:rFonts w:hint="default" w:asciiTheme="majorEastAsia" w:hAnsiTheme="majorEastAsia" w:eastAsiaTheme="majorEastAsia" w:cstheme="majorEastAsia"/>
-                <w:b w:val="0"/>
-                <w:bCs w:val="0"/>
-                <w:color w:val="auto"/>
-                <w:sz w:val="20"/>
-                <w:szCs w:val="20"/>
-                <w:vertAlign w:val="baseline"/>
-              </w:rPr>
-              <w:t>_i</w:t>
+              <w:t>slv_haddr_</w:t>
+            </w:r>
+            <w:r>
+              <w:rPr>
+                <w:rFonts w:hint="default" w:asciiTheme="majorEastAsia" w:hAnsiTheme="majorEastAsia" w:eastAsiaTheme="majorEastAsia" w:cstheme="majorEastAsia"/>
+                <w:b w:val="0"/>
+                <w:bCs w:val="0"/>
+                <w:color w:val="auto"/>
+                <w:sz w:val="20"/>
+                <w:szCs w:val="20"/>
+                <w:vertAlign w:val="baseline"/>
+              </w:rPr>
+              <w:t>o</w:t>
             </w:r>
           </w:p>
         </w:tc>
@@ -10101,13 +10151,13 @@
                 <w:szCs w:val="20"/>
                 <w:vertAlign w:val="baseline"/>
               </w:rPr>
-              <w:t>Input</w:t>
-            </w:r>
-          </w:p>
-        </w:tc>
-        <w:tc>
-          <w:tcPr>
-            <w:tcW w:w="1150" w:type="dxa"/>
+              <w:t>Ouput</w:t>
+            </w:r>
+          </w:p>
+        </w:tc>
+        <w:tc>
+          <w:tcPr>
+            <w:tcW w:w="1368" w:type="dxa"/>
             <w:tcBorders>
               <w:tl2br w:val="nil"/>
               <w:tr2bl w:val="nil"/>
@@ -10130,11 +10180,23 @@
                 <w:vertAlign w:val="baseline"/>
               </w:rPr>
             </w:pPr>
-          </w:p>
-        </w:tc>
-        <w:tc>
-          <w:tcPr>
-            <w:tcW w:w="4241" w:type="dxa"/>
+            <w:r>
+              <w:rPr>
+                <w:rFonts w:hint="default" w:asciiTheme="majorEastAsia" w:hAnsiTheme="majorEastAsia" w:eastAsiaTheme="majorEastAsia" w:cstheme="majorEastAsia"/>
+                <w:b w:val="0"/>
+                <w:bCs w:val="0"/>
+                <w:color w:val="auto"/>
+                <w:sz w:val="20"/>
+                <w:szCs w:val="20"/>
+                <w:vertAlign w:val="baseline"/>
+              </w:rPr>
+              <w:t>AW</w:t>
+            </w:r>
+          </w:p>
+        </w:tc>
+        <w:tc>
+          <w:tcPr>
+            <w:tcW w:w="3995" w:type="dxa"/>
             <w:tcBorders>
               <w:tl2br w:val="nil"/>
               <w:tr2bl w:val="nil"/>
@@ -10215,19 +10277,19 @@
                 <w:szCs w:val="20"/>
                 <w:vertAlign w:val="baseline"/>
               </w:rPr>
-              <w:t>slv_hwdata</w:t>
-            </w:r>
-            <w:r>
-              <w:rPr>
-                <w:rFonts w:hint="default" w:asciiTheme="majorEastAsia" w:hAnsiTheme="majorEastAsia" w:eastAsiaTheme="majorEastAsia" w:cstheme="majorEastAsia"/>
-                <w:b w:val="0"/>
-                <w:bCs w:val="0"/>
-                <w:color w:val="auto"/>
-                <w:sz w:val="20"/>
-                <w:szCs w:val="20"/>
-                <w:vertAlign w:val="baseline"/>
-              </w:rPr>
-              <w:t>_i</w:t>
+              <w:t>slv_hburst_</w:t>
+            </w:r>
+            <w:r>
+              <w:rPr>
+                <w:rFonts w:hint="default" w:asciiTheme="majorEastAsia" w:hAnsiTheme="majorEastAsia" w:eastAsiaTheme="majorEastAsia" w:cstheme="majorEastAsia"/>
+                <w:b w:val="0"/>
+                <w:bCs w:val="0"/>
+                <w:color w:val="auto"/>
+                <w:sz w:val="20"/>
+                <w:szCs w:val="20"/>
+                <w:vertAlign w:val="baseline"/>
+              </w:rPr>
+              <w:t>o</w:t>
             </w:r>
           </w:p>
         </w:tc>
@@ -10265,13 +10327,13 @@
                 <w:szCs w:val="20"/>
                 <w:vertAlign w:val="baseline"/>
               </w:rPr>
-              <w:t>Input</w:t>
-            </w:r>
-          </w:p>
-        </w:tc>
-        <w:tc>
-          <w:tcPr>
-            <w:tcW w:w="1150" w:type="dxa"/>
+              <w:t>Ouput</w:t>
+            </w:r>
+          </w:p>
+        </w:tc>
+        <w:tc>
+          <w:tcPr>
+            <w:tcW w:w="1368" w:type="dxa"/>
             <w:tcBorders>
               <w:tl2br w:val="nil"/>
               <w:tr2bl w:val="nil"/>
@@ -10294,11 +10356,23 @@
                 <w:vertAlign w:val="baseline"/>
               </w:rPr>
             </w:pPr>
-          </w:p>
-        </w:tc>
-        <w:tc>
-          <w:tcPr>
-            <w:tcW w:w="4241" w:type="dxa"/>
+            <w:r>
+              <w:rPr>
+                <w:rFonts w:hint="default" w:asciiTheme="majorEastAsia" w:hAnsiTheme="majorEastAsia" w:eastAsiaTheme="majorEastAsia" w:cstheme="majorEastAsia"/>
+                <w:b w:val="0"/>
+                <w:bCs w:val="0"/>
+                <w:color w:val="auto"/>
+                <w:sz w:val="20"/>
+                <w:szCs w:val="20"/>
+                <w:vertAlign w:val="baseline"/>
+              </w:rPr>
+              <w:t>3</w:t>
+            </w:r>
+          </w:p>
+        </w:tc>
+        <w:tc>
+          <w:tcPr>
+            <w:tcW w:w="3995" w:type="dxa"/>
             <w:tcBorders>
               <w:tl2br w:val="nil"/>
               <w:tr2bl w:val="nil"/>
@@ -10379,19 +10453,19 @@
                 <w:szCs w:val="20"/>
                 <w:vertAlign w:val="baseline"/>
               </w:rPr>
-              <w:t>slv_hwstrb</w:t>
-            </w:r>
-            <w:r>
-              <w:rPr>
-                <w:rFonts w:hint="default" w:asciiTheme="majorEastAsia" w:hAnsiTheme="majorEastAsia" w:eastAsiaTheme="majorEastAsia" w:cstheme="majorEastAsia"/>
-                <w:b w:val="0"/>
-                <w:bCs w:val="0"/>
-                <w:color w:val="auto"/>
-                <w:sz w:val="20"/>
-                <w:szCs w:val="20"/>
-                <w:vertAlign w:val="baseline"/>
-              </w:rPr>
-              <w:t>_i</w:t>
+              <w:t>slv_hsize_</w:t>
+            </w:r>
+            <w:r>
+              <w:rPr>
+                <w:rFonts w:hint="default" w:asciiTheme="majorEastAsia" w:hAnsiTheme="majorEastAsia" w:eastAsiaTheme="majorEastAsia" w:cstheme="majorEastAsia"/>
+                <w:b w:val="0"/>
+                <w:bCs w:val="0"/>
+                <w:color w:val="auto"/>
+                <w:sz w:val="20"/>
+                <w:szCs w:val="20"/>
+                <w:vertAlign w:val="baseline"/>
+              </w:rPr>
+              <w:t>o</w:t>
             </w:r>
           </w:p>
         </w:tc>
@@ -10429,13 +10503,13 @@
                 <w:szCs w:val="20"/>
                 <w:vertAlign w:val="baseline"/>
               </w:rPr>
-              <w:t>Input</w:t>
-            </w:r>
-          </w:p>
-        </w:tc>
-        <w:tc>
-          <w:tcPr>
-            <w:tcW w:w="1150" w:type="dxa"/>
+              <w:t>Ouput</w:t>
+            </w:r>
+          </w:p>
+        </w:tc>
+        <w:tc>
+          <w:tcPr>
+            <w:tcW w:w="1368" w:type="dxa"/>
             <w:tcBorders>
               <w:tl2br w:val="nil"/>
               <w:tr2bl w:val="nil"/>
@@ -10458,11 +10532,23 @@
                 <w:vertAlign w:val="baseline"/>
               </w:rPr>
             </w:pPr>
-          </w:p>
-        </w:tc>
-        <w:tc>
-          <w:tcPr>
-            <w:tcW w:w="4241" w:type="dxa"/>
+            <w:r>
+              <w:rPr>
+                <w:rFonts w:hint="default" w:asciiTheme="majorEastAsia" w:hAnsiTheme="majorEastAsia" w:eastAsiaTheme="majorEastAsia" w:cstheme="majorEastAsia"/>
+                <w:b w:val="0"/>
+                <w:bCs w:val="0"/>
+                <w:color w:val="auto"/>
+                <w:sz w:val="20"/>
+                <w:szCs w:val="20"/>
+                <w:vertAlign w:val="baseline"/>
+              </w:rPr>
+              <w:t>3</w:t>
+            </w:r>
+          </w:p>
+        </w:tc>
+        <w:tc>
+          <w:tcPr>
+            <w:tcW w:w="3995" w:type="dxa"/>
             <w:tcBorders>
               <w:tl2br w:val="nil"/>
               <w:tr2bl w:val="nil"/>
@@ -10543,19 +10629,19 @@
                 <w:szCs w:val="20"/>
                 <w:vertAlign w:val="baseline"/>
               </w:rPr>
-              <w:t>slv_hwrite</w:t>
-            </w:r>
-            <w:r>
-              <w:rPr>
-                <w:rFonts w:hint="default" w:asciiTheme="majorEastAsia" w:hAnsiTheme="majorEastAsia" w:eastAsiaTheme="majorEastAsia" w:cstheme="majorEastAsia"/>
-                <w:b w:val="0"/>
-                <w:bCs w:val="0"/>
-                <w:color w:val="auto"/>
-                <w:sz w:val="20"/>
-                <w:szCs w:val="20"/>
-                <w:vertAlign w:val="baseline"/>
-              </w:rPr>
-              <w:t>_i</w:t>
+              <w:t>slv_htrans_</w:t>
+            </w:r>
+            <w:r>
+              <w:rPr>
+                <w:rFonts w:hint="default" w:asciiTheme="majorEastAsia" w:hAnsiTheme="majorEastAsia" w:eastAsiaTheme="majorEastAsia" w:cstheme="majorEastAsia"/>
+                <w:b w:val="0"/>
+                <w:bCs w:val="0"/>
+                <w:color w:val="auto"/>
+                <w:sz w:val="20"/>
+                <w:szCs w:val="20"/>
+                <w:vertAlign w:val="baseline"/>
+              </w:rPr>
+              <w:t>o</w:t>
             </w:r>
           </w:p>
         </w:tc>
@@ -10593,13 +10679,13 @@
                 <w:szCs w:val="20"/>
                 <w:vertAlign w:val="baseline"/>
               </w:rPr>
-              <w:t>Input</w:t>
-            </w:r>
-          </w:p>
-        </w:tc>
-        <w:tc>
-          <w:tcPr>
-            <w:tcW w:w="1150" w:type="dxa"/>
+              <w:t>Ouput</w:t>
+            </w:r>
+          </w:p>
+        </w:tc>
+        <w:tc>
+          <w:tcPr>
+            <w:tcW w:w="1368" w:type="dxa"/>
             <w:tcBorders>
               <w:tl2br w:val="nil"/>
               <w:tr2bl w:val="nil"/>
@@ -10622,11 +10708,23 @@
                 <w:vertAlign w:val="baseline"/>
               </w:rPr>
             </w:pPr>
-          </w:p>
-        </w:tc>
-        <w:tc>
-          <w:tcPr>
-            <w:tcW w:w="4241" w:type="dxa"/>
+            <w:r>
+              <w:rPr>
+                <w:rFonts w:hint="default" w:asciiTheme="majorEastAsia" w:hAnsiTheme="majorEastAsia" w:eastAsiaTheme="majorEastAsia" w:cstheme="majorEastAsia"/>
+                <w:b w:val="0"/>
+                <w:bCs w:val="0"/>
+                <w:color w:val="auto"/>
+                <w:sz w:val="20"/>
+                <w:szCs w:val="20"/>
+                <w:vertAlign w:val="baseline"/>
+              </w:rPr>
+              <w:t>2</w:t>
+            </w:r>
+          </w:p>
+        </w:tc>
+        <w:tc>
+          <w:tcPr>
+            <w:tcW w:w="3995" w:type="dxa"/>
             <w:tcBorders>
               <w:tl2br w:val="nil"/>
               <w:tr2bl w:val="nil"/>
@@ -10688,38 +10786,38 @@
               <w:widowControl w:val="0"/>
               <w:jc w:val="left"/>
               <w:rPr>
-                <w:rFonts w:hint="default" w:asciiTheme="majorEastAsia" w:hAnsiTheme="majorEastAsia" w:eastAsiaTheme="majorEastAsia" w:cstheme="majorEastAsia"/>
-                <w:b w:val="0"/>
-                <w:bCs w:val="0"/>
-                <w:color w:val="auto"/>
-                <w:sz w:val="20"/>
-                <w:szCs w:val="20"/>
-                <w:vertAlign w:val="baseline"/>
-              </w:rPr>
-            </w:pPr>
-            <w:r>
-              <w:rPr>
-                <w:rFonts w:hint="default" w:asciiTheme="majorEastAsia" w:hAnsiTheme="majorEastAsia" w:eastAsiaTheme="majorEastAsia" w:cstheme="majorEastAsia"/>
-                <w:b w:val="0"/>
-                <w:bCs w:val="0"/>
-                <w:color w:val="auto"/>
-                <w:sz w:val="20"/>
-                <w:szCs w:val="20"/>
-                <w:vertAlign w:val="baseline"/>
-              </w:rPr>
-              <w:t>slv_hsel</w:t>
-            </w:r>
-            <w:r>
-              <w:rPr>
-                <w:rFonts w:hint="default" w:asciiTheme="majorEastAsia" w:hAnsiTheme="majorEastAsia" w:eastAsiaTheme="majorEastAsia" w:cstheme="majorEastAsia"/>
-                <w:b w:val="0"/>
-                <w:bCs w:val="0"/>
-                <w:color w:val="auto"/>
-                <w:sz w:val="20"/>
-                <w:szCs w:val="20"/>
-                <w:vertAlign w:val="baseline"/>
-              </w:rPr>
-              <w:t>_i</w:t>
+                <w:rFonts w:hint="eastAsia" w:asciiTheme="majorEastAsia" w:hAnsiTheme="majorEastAsia" w:eastAsiaTheme="majorEastAsia" w:cstheme="majorEastAsia"/>
+                <w:b w:val="0"/>
+                <w:bCs w:val="0"/>
+                <w:color w:val="auto"/>
+                <w:sz w:val="20"/>
+                <w:szCs w:val="20"/>
+                <w:vertAlign w:val="baseline"/>
+              </w:rPr>
+            </w:pPr>
+            <w:r>
+              <w:rPr>
+                <w:rFonts w:hint="default" w:asciiTheme="majorEastAsia" w:hAnsiTheme="majorEastAsia" w:eastAsiaTheme="majorEastAsia" w:cstheme="majorEastAsia"/>
+                <w:b w:val="0"/>
+                <w:bCs w:val="0"/>
+                <w:color w:val="auto"/>
+                <w:sz w:val="20"/>
+                <w:szCs w:val="20"/>
+                <w:vertAlign w:val="baseline"/>
+              </w:rPr>
+              <w:t>slv_hwdata_</w:t>
+            </w:r>
+            <w:r>
+              <w:rPr>
+                <w:rFonts w:hint="default" w:asciiTheme="majorEastAsia" w:hAnsiTheme="majorEastAsia" w:eastAsiaTheme="majorEastAsia" w:cstheme="majorEastAsia"/>
+                <w:b w:val="0"/>
+                <w:bCs w:val="0"/>
+                <w:color w:val="auto"/>
+                <w:sz w:val="20"/>
+                <w:szCs w:val="20"/>
+                <w:vertAlign w:val="baseline"/>
+              </w:rPr>
+              <w:t>o</w:t>
             </w:r>
           </w:p>
         </w:tc>
@@ -10757,13 +10855,13 @@
                 <w:szCs w:val="20"/>
                 <w:vertAlign w:val="baseline"/>
               </w:rPr>
-              <w:t>Input</w:t>
-            </w:r>
-          </w:p>
-        </w:tc>
-        <w:tc>
-          <w:tcPr>
-            <w:tcW w:w="1150" w:type="dxa"/>
+              <w:t>Ouput</w:t>
+            </w:r>
+          </w:p>
+        </w:tc>
+        <w:tc>
+          <w:tcPr>
+            <w:tcW w:w="1368" w:type="dxa"/>
             <w:tcBorders>
               <w:tl2br w:val="nil"/>
               <w:tr2bl w:val="nil"/>
@@ -10786,11 +10884,23 @@
                 <w:vertAlign w:val="baseline"/>
               </w:rPr>
             </w:pPr>
-          </w:p>
-        </w:tc>
-        <w:tc>
-          <w:tcPr>
-            <w:tcW w:w="4241" w:type="dxa"/>
+            <w:r>
+              <w:rPr>
+                <w:rFonts w:hint="default" w:asciiTheme="majorEastAsia" w:hAnsiTheme="majorEastAsia" w:eastAsiaTheme="majorEastAsia" w:cstheme="majorEastAsia"/>
+                <w:b w:val="0"/>
+                <w:bCs w:val="0"/>
+                <w:color w:val="auto"/>
+                <w:sz w:val="20"/>
+                <w:szCs w:val="20"/>
+                <w:vertAlign w:val="baseline"/>
+              </w:rPr>
+              <w:t>DW</w:t>
+            </w:r>
+          </w:p>
+        </w:tc>
+        <w:tc>
+          <w:tcPr>
+            <w:tcW w:w="3995" w:type="dxa"/>
             <w:tcBorders>
               <w:tl2br w:val="nil"/>
               <w:tr2bl w:val="nil"/>
@@ -10871,19 +10981,19 @@
                 <w:szCs w:val="20"/>
                 <w:vertAlign w:val="baseline"/>
               </w:rPr>
-              <w:t>slv_hrdata</w:t>
-            </w:r>
-            <w:r>
-              <w:rPr>
-                <w:rFonts w:hint="default" w:asciiTheme="majorEastAsia" w:hAnsiTheme="majorEastAsia" w:eastAsiaTheme="majorEastAsia" w:cstheme="majorEastAsia"/>
-                <w:b w:val="0"/>
-                <w:bCs w:val="0"/>
-                <w:color w:val="auto"/>
-                <w:sz w:val="20"/>
-                <w:szCs w:val="20"/>
-                <w:vertAlign w:val="baseline"/>
-              </w:rPr>
-              <w:t>_o</w:t>
+              <w:t>slv_hwstrb_</w:t>
+            </w:r>
+            <w:r>
+              <w:rPr>
+                <w:rFonts w:hint="default" w:asciiTheme="majorEastAsia" w:hAnsiTheme="majorEastAsia" w:eastAsiaTheme="majorEastAsia" w:cstheme="majorEastAsia"/>
+                <w:b w:val="0"/>
+                <w:bCs w:val="0"/>
+                <w:color w:val="auto"/>
+                <w:sz w:val="20"/>
+                <w:szCs w:val="20"/>
+                <w:vertAlign w:val="baseline"/>
+              </w:rPr>
+              <w:t>o</w:t>
             </w:r>
           </w:p>
         </w:tc>
@@ -10927,33 +11037,46 @@
         </w:tc>
         <w:tc>
           <w:tcPr>
-            <w:tcW w:w="1150" w:type="dxa"/>
-            <w:tcBorders>
-              <w:tl2br w:val="nil"/>
-              <w:tr2bl w:val="nil"/>
-            </w:tcBorders>
-            <w:shd w:val="clear" w:color="auto" w:fill="auto"/>
-            <w:vAlign w:val="top"/>
-          </w:tcPr>
-          <w:p>
-            <w:pPr>
-              <w:widowControl w:val="0"/>
-              <w:jc w:val="left"/>
-              <w:rPr>
-                <w:rFonts w:hint="eastAsia" w:asciiTheme="majorEastAsia" w:hAnsiTheme="majorEastAsia" w:eastAsiaTheme="majorEastAsia" w:cstheme="majorEastAsia"/>
-                <w:b w:val="0"/>
-                <w:bCs w:val="0"/>
-                <w:color w:val="auto"/>
-                <w:sz w:val="20"/>
-                <w:szCs w:val="20"/>
-                <w:vertAlign w:val="baseline"/>
-              </w:rPr>
-            </w:pPr>
-          </w:p>
-        </w:tc>
-        <w:tc>
-          <w:tcPr>
-            <w:tcW w:w="4241" w:type="dxa"/>
+            <w:tcW w:w="1368" w:type="dxa"/>
+            <w:tcBorders>
+              <w:tl2br w:val="nil"/>
+              <w:tr2bl w:val="nil"/>
+            </w:tcBorders>
+            <w:shd w:val="clear" w:color="auto" w:fill="auto"/>
+            <w:textDirection w:val="lrTbV"/>
+            <w:vAlign w:val="center"/>
+          </w:tcPr>
+          <w:p>
+            <w:pPr>
+              <w:widowControl w:val="0"/>
+              <w:jc w:val="both"/>
+              <w:rPr>
+                <w:rFonts w:hint="eastAsia" w:asciiTheme="majorEastAsia" w:hAnsiTheme="majorEastAsia" w:eastAsiaTheme="majorEastAsia" w:cstheme="majorEastAsia"/>
+                <w:b w:val="0"/>
+                <w:bCs w:val="0"/>
+                <w:color w:val="auto"/>
+                <w:sz w:val="20"/>
+                <w:szCs w:val="20"/>
+                <w:vertAlign w:val="baseline"/>
+              </w:rPr>
+            </w:pPr>
+            <w:r>
+              <w:rPr>
+                <w:rFonts w:hint="default" w:asciiTheme="majorEastAsia" w:hAnsiTheme="majorEastAsia" w:eastAsiaTheme="majorEastAsia" w:cstheme="majorEastAsia"/>
+                <w:b w:val="0"/>
+                <w:bCs w:val="0"/>
+                <w:color w:val="auto"/>
+                <w:sz w:val="20"/>
+                <w:szCs w:val="20"/>
+                <w:vertAlign w:val="baseline"/>
+              </w:rPr>
+              <w:t>DW/8</w:t>
+            </w:r>
+          </w:p>
+        </w:tc>
+        <w:tc>
+          <w:tcPr>
+            <w:tcW w:w="3995" w:type="dxa"/>
             <w:tcBorders>
               <w:tl2br w:val="nil"/>
               <w:tr2bl w:val="nil"/>
@@ -11034,19 +11157,19 @@
                 <w:szCs w:val="20"/>
                 <w:vertAlign w:val="baseline"/>
               </w:rPr>
-              <w:t>slv_hresp</w:t>
-            </w:r>
-            <w:r>
-              <w:rPr>
-                <w:rFonts w:hint="default" w:asciiTheme="majorEastAsia" w:hAnsiTheme="majorEastAsia" w:eastAsiaTheme="majorEastAsia" w:cstheme="majorEastAsia"/>
-                <w:b w:val="0"/>
-                <w:bCs w:val="0"/>
-                <w:color w:val="auto"/>
-                <w:sz w:val="20"/>
-                <w:szCs w:val="20"/>
-                <w:vertAlign w:val="baseline"/>
-              </w:rPr>
-              <w:t>_o</w:t>
+              <w:t>slv_hwrite_</w:t>
+            </w:r>
+            <w:r>
+              <w:rPr>
+                <w:rFonts w:hint="default" w:asciiTheme="majorEastAsia" w:hAnsiTheme="majorEastAsia" w:eastAsiaTheme="majorEastAsia" w:cstheme="majorEastAsia"/>
+                <w:b w:val="0"/>
+                <w:bCs w:val="0"/>
+                <w:color w:val="auto"/>
+                <w:sz w:val="20"/>
+                <w:szCs w:val="20"/>
+                <w:vertAlign w:val="baseline"/>
+              </w:rPr>
+              <w:t>o</w:t>
             </w:r>
           </w:p>
         </w:tc>
@@ -11090,33 +11213,46 @@
         </w:tc>
         <w:tc>
           <w:tcPr>
-            <w:tcW w:w="1150" w:type="dxa"/>
-            <w:tcBorders>
-              <w:tl2br w:val="nil"/>
-              <w:tr2bl w:val="nil"/>
-            </w:tcBorders>
-            <w:shd w:val="clear" w:color="auto" w:fill="auto"/>
-            <w:vAlign w:val="top"/>
-          </w:tcPr>
-          <w:p>
-            <w:pPr>
-              <w:widowControl w:val="0"/>
-              <w:jc w:val="left"/>
-              <w:rPr>
-                <w:rFonts w:hint="eastAsia" w:asciiTheme="majorEastAsia" w:hAnsiTheme="majorEastAsia" w:eastAsiaTheme="majorEastAsia" w:cstheme="majorEastAsia"/>
-                <w:b w:val="0"/>
-                <w:bCs w:val="0"/>
-                <w:color w:val="auto"/>
-                <w:sz w:val="20"/>
-                <w:szCs w:val="20"/>
-                <w:vertAlign w:val="baseline"/>
-              </w:rPr>
-            </w:pPr>
-          </w:p>
-        </w:tc>
-        <w:tc>
-          <w:tcPr>
-            <w:tcW w:w="4241" w:type="dxa"/>
+            <w:tcW w:w="1368" w:type="dxa"/>
+            <w:tcBorders>
+              <w:tl2br w:val="nil"/>
+              <w:tr2bl w:val="nil"/>
+            </w:tcBorders>
+            <w:shd w:val="clear" w:color="auto" w:fill="auto"/>
+            <w:textDirection w:val="lrTbV"/>
+            <w:vAlign w:val="center"/>
+          </w:tcPr>
+          <w:p>
+            <w:pPr>
+              <w:widowControl w:val="0"/>
+              <w:jc w:val="both"/>
+              <w:rPr>
+                <w:rFonts w:hint="eastAsia" w:asciiTheme="majorEastAsia" w:hAnsiTheme="majorEastAsia" w:eastAsiaTheme="majorEastAsia" w:cstheme="majorEastAsia"/>
+                <w:b w:val="0"/>
+                <w:bCs w:val="0"/>
+                <w:color w:val="auto"/>
+                <w:sz w:val="20"/>
+                <w:szCs w:val="20"/>
+                <w:vertAlign w:val="baseline"/>
+              </w:rPr>
+            </w:pPr>
+            <w:r>
+              <w:rPr>
+                <w:rFonts w:hint="default" w:asciiTheme="majorEastAsia" w:hAnsiTheme="majorEastAsia" w:eastAsiaTheme="majorEastAsia" w:cstheme="majorEastAsia"/>
+                <w:b w:val="0"/>
+                <w:bCs w:val="0"/>
+                <w:color w:val="auto"/>
+                <w:sz w:val="20"/>
+                <w:szCs w:val="20"/>
+                <w:vertAlign w:val="baseline"/>
+              </w:rPr>
+              <w:t>1</w:t>
+            </w:r>
+          </w:p>
+        </w:tc>
+        <w:tc>
+          <w:tcPr>
+            <w:tcW w:w="3995" w:type="dxa"/>
             <w:tcBorders>
               <w:tl2br w:val="nil"/>
               <w:tr2bl w:val="nil"/>
@@ -11178,38 +11314,38 @@
               <w:widowControl w:val="0"/>
               <w:jc w:val="left"/>
               <w:rPr>
-                <w:rFonts w:hint="eastAsia" w:asciiTheme="majorEastAsia" w:hAnsiTheme="majorEastAsia" w:eastAsiaTheme="majorEastAsia" w:cstheme="majorEastAsia"/>
-                <w:b w:val="0"/>
-                <w:bCs w:val="0"/>
-                <w:color w:val="auto"/>
-                <w:sz w:val="20"/>
-                <w:szCs w:val="20"/>
-                <w:vertAlign w:val="baseline"/>
-              </w:rPr>
-            </w:pPr>
-            <w:r>
-              <w:rPr>
-                <w:rFonts w:hint="default" w:asciiTheme="majorEastAsia" w:hAnsiTheme="majorEastAsia" w:eastAsiaTheme="majorEastAsia" w:cstheme="majorEastAsia"/>
-                <w:b w:val="0"/>
-                <w:bCs w:val="0"/>
-                <w:color w:val="auto"/>
-                <w:sz w:val="20"/>
-                <w:szCs w:val="20"/>
-                <w:vertAlign w:val="baseline"/>
-              </w:rPr>
-              <w:t>slv_hreadyout</w:t>
-            </w:r>
-            <w:r>
-              <w:rPr>
-                <w:rFonts w:hint="default" w:asciiTheme="majorEastAsia" w:hAnsiTheme="majorEastAsia" w:eastAsiaTheme="majorEastAsia" w:cstheme="majorEastAsia"/>
-                <w:b w:val="0"/>
-                <w:bCs w:val="0"/>
-                <w:color w:val="auto"/>
-                <w:sz w:val="20"/>
-                <w:szCs w:val="20"/>
-                <w:vertAlign w:val="baseline"/>
-              </w:rPr>
-              <w:t>_o</w:t>
+                <w:rFonts w:hint="default" w:asciiTheme="majorEastAsia" w:hAnsiTheme="majorEastAsia" w:eastAsiaTheme="majorEastAsia" w:cstheme="majorEastAsia"/>
+                <w:b w:val="0"/>
+                <w:bCs w:val="0"/>
+                <w:color w:val="auto"/>
+                <w:sz w:val="20"/>
+                <w:szCs w:val="20"/>
+                <w:vertAlign w:val="baseline"/>
+              </w:rPr>
+            </w:pPr>
+            <w:r>
+              <w:rPr>
+                <w:rFonts w:hint="default" w:asciiTheme="majorEastAsia" w:hAnsiTheme="majorEastAsia" w:eastAsiaTheme="majorEastAsia" w:cstheme="majorEastAsia"/>
+                <w:b w:val="0"/>
+                <w:bCs w:val="0"/>
+                <w:color w:val="auto"/>
+                <w:sz w:val="20"/>
+                <w:szCs w:val="20"/>
+                <w:vertAlign w:val="baseline"/>
+              </w:rPr>
+              <w:t>slv_hsel_</w:t>
+            </w:r>
+            <w:r>
+              <w:rPr>
+                <w:rFonts w:hint="default" w:asciiTheme="majorEastAsia" w:hAnsiTheme="majorEastAsia" w:eastAsiaTheme="majorEastAsia" w:cstheme="majorEastAsia"/>
+                <w:b w:val="0"/>
+                <w:bCs w:val="0"/>
+                <w:color w:val="auto"/>
+                <w:sz w:val="20"/>
+                <w:szCs w:val="20"/>
+                <w:vertAlign w:val="baseline"/>
+              </w:rPr>
+              <w:t>o</w:t>
             </w:r>
           </w:p>
         </w:tc>
@@ -11253,33 +11389,48 @@
         </w:tc>
         <w:tc>
           <w:tcPr>
-            <w:tcW w:w="1150" w:type="dxa"/>
-            <w:tcBorders>
-              <w:tl2br w:val="nil"/>
-              <w:tr2bl w:val="nil"/>
-            </w:tcBorders>
-            <w:shd w:val="clear" w:color="auto" w:fill="auto"/>
-            <w:vAlign w:val="top"/>
-          </w:tcPr>
-          <w:p>
-            <w:pPr>
-              <w:widowControl w:val="0"/>
-              <w:jc w:val="left"/>
-              <w:rPr>
-                <w:rFonts w:hint="eastAsia" w:asciiTheme="majorEastAsia" w:hAnsiTheme="majorEastAsia" w:eastAsiaTheme="majorEastAsia" w:cstheme="majorEastAsia"/>
-                <w:b w:val="0"/>
-                <w:bCs w:val="0"/>
-                <w:color w:val="auto"/>
-                <w:sz w:val="20"/>
-                <w:szCs w:val="20"/>
-                <w:vertAlign w:val="baseline"/>
-              </w:rPr>
-            </w:pPr>
-          </w:p>
-        </w:tc>
-        <w:tc>
-          <w:tcPr>
-            <w:tcW w:w="4241" w:type="dxa"/>
+            <w:tcW w:w="1368" w:type="dxa"/>
+            <w:tcBorders>
+              <w:tl2br w:val="nil"/>
+              <w:tr2bl w:val="nil"/>
+            </w:tcBorders>
+            <w:shd w:val="clear" w:color="auto" w:fill="auto"/>
+            <w:textDirection w:val="lrTbV"/>
+            <w:vAlign w:val="center"/>
+          </w:tcPr>
+          <w:p>
+            <w:pPr>
+              <w:widowControl w:val="0"/>
+              <w:jc w:val="both"/>
+              <w:rPr>
+                <w:rFonts w:hint="eastAsia" w:asciiTheme="majorEastAsia" w:hAnsiTheme="majorEastAsia" w:eastAsiaTheme="majorEastAsia" w:cstheme="majorEastAsia"/>
+                <w:b w:val="0"/>
+                <w:bCs w:val="0"/>
+                <w:color w:val="auto"/>
+                <w:sz w:val="20"/>
+                <w:szCs w:val="20"/>
+                <w:vertAlign w:val="baseline"/>
+              </w:rPr>
+            </w:pPr>
+            <w:r>
+              <w:rPr>
+                <w:rFonts w:hint="default" w:asciiTheme="majorEastAsia" w:hAnsiTheme="majorEastAsia" w:eastAsiaTheme="majorEastAsia" w:cstheme="majorEastAsia"/>
+                <w:b w:val="0"/>
+                <w:bCs w:val="0"/>
+                <w:color w:val="auto"/>
+                <w:sz w:val="20"/>
+                <w:szCs w:val="20"/>
+                <w:vertAlign w:val="baseline"/>
+              </w:rPr>
+              <w:t>NS</w:t>
+            </w:r>
+            <w:bookmarkStart w:id="0" w:name="_GoBack"/>
+            <w:bookmarkEnd w:id="0"/>
+          </w:p>
+        </w:tc>
+        <w:tc>
+          <w:tcPr>
+            <w:tcW w:w="3995" w:type="dxa"/>
             <w:tcBorders>
               <w:tl2br w:val="nil"/>
               <w:tr2bl w:val="nil"/>

</xml_diff>

<commit_message>
Backed up when drawing logic implementation for ahb interconnect
</commit_message>
<xml_diff>
--- a/docs/SimpleMCU_MAS.docx
+++ b/docs/SimpleMCU_MAS.docx
@@ -716,9 +716,9 @@
         </w:rPr>
         <w:drawing>
           <wp:inline distT="0" distB="0" distL="114300" distR="114300">
-            <wp:extent cx="5105400" cy="3439160"/>
-            <wp:effectExtent l="0" t="0" r="0" b="8890"/>
-            <wp:docPr id="3" name="Picture 3" descr="/home/long-nguyen/work/spmcu/docs/block_diagram/top.pngtop"/>
+            <wp:extent cx="4868545" cy="3439160"/>
+            <wp:effectExtent l="0" t="0" r="8255" b="8890"/>
+            <wp:docPr id="3" name="Picture 3" descr="/home/long-nguyen/work/spmcu/docs/block_diagram/spmcu.pngspmcu"/>
             <wp:cNvGraphicFramePr>
               <a:graphicFrameLocks xmlns:a="http://schemas.openxmlformats.org/drawingml/2006/main" noChangeAspect="1"/>
             </wp:cNvGraphicFramePr>
@@ -726,7 +726,7 @@
               <a:graphicData uri="http://schemas.openxmlformats.org/drawingml/2006/picture">
                 <pic:pic xmlns:pic="http://schemas.openxmlformats.org/drawingml/2006/picture">
                   <pic:nvPicPr>
-                    <pic:cNvPr id="3" name="Picture 3" descr="/home/long-nguyen/work/spmcu/docs/block_diagram/top.pngtop"/>
+                    <pic:cNvPr id="3" name="Picture 3" descr="/home/long-nguyen/work/spmcu/docs/block_diagram/spmcu.pngspmcu"/>
                     <pic:cNvPicPr>
                       <a:picLocks noChangeAspect="1"/>
                     </pic:cNvPicPr>
@@ -741,7 +741,7 @@
                   <pic:spPr>
                     <a:xfrm>
                       <a:off x="0" y="0"/>
-                      <a:ext cx="5105400" cy="3439160"/>
+                      <a:ext cx="4868545" cy="3439160"/>
                     </a:xfrm>
                     <a:prstGeom prst="rect">
                       <a:avLst/>
@@ -5024,6 +5024,397 @@
           <w:sz w:val="20"/>
           <w:szCs w:val="20"/>
         </w:rPr>
+        <w:t>Common</w:t>
+      </w:r>
+    </w:p>
+    <w:p>
+      <w:pPr>
+        <w:numPr>
+          <w:ilvl w:val="1"/>
+          <w:numId w:val="3"/>
+        </w:numPr>
+        <w:ind w:left="0" w:leftChars="0" w:firstLine="0" w:firstLineChars="0"/>
+        <w:jc w:val="left"/>
+        <w:outlineLvl w:val="0"/>
+        <w:rPr>
+          <w:rFonts w:hint="eastAsia" w:asciiTheme="majorEastAsia" w:hAnsiTheme="majorEastAsia" w:eastAsiaTheme="majorEastAsia" w:cstheme="majorEastAsia"/>
+          <w:b/>
+          <w:bCs/>
+          <w:i w:val="0"/>
+          <w:iCs w:val="0"/>
+          <w:color w:val="002060"/>
+          <w:sz w:val="20"/>
+          <w:szCs w:val="20"/>
+        </w:rPr>
+      </w:pPr>
+      <w:r>
+        <w:rPr>
+          <w:rFonts w:hint="default" w:asciiTheme="majorEastAsia" w:hAnsiTheme="majorEastAsia" w:eastAsiaTheme="majorEastAsia" w:cstheme="majorEastAsia"/>
+          <w:b/>
+          <w:bCs/>
+          <w:i w:val="0"/>
+          <w:iCs w:val="0"/>
+          <w:color w:val="002060"/>
+          <w:sz w:val="20"/>
+          <w:szCs w:val="20"/>
+        </w:rPr>
+        <w:t>Round Robin Arbiter</w:t>
+      </w:r>
+    </w:p>
+    <w:tbl>
+      <w:tblPr>
+        <w:tblStyle w:val="5"/>
+        <w:tblW w:w="7962" w:type="dxa"/>
+        <w:tblInd w:w="475" w:type="dxa"/>
+        <w:tblBorders>
+          <w:top w:val="none" w:color="auto" w:sz="0" w:space="0"/>
+          <w:left w:val="none" w:color="auto" w:sz="0" w:space="0"/>
+          <w:bottom w:val="none" w:color="auto" w:sz="0" w:space="0"/>
+          <w:right w:val="none" w:color="auto" w:sz="0" w:space="0"/>
+          <w:insideH w:val="none" w:color="auto" w:sz="0" w:space="0"/>
+          <w:insideV w:val="none" w:color="auto" w:sz="0" w:space="0"/>
+        </w:tblBorders>
+        <w:tblLayout w:type="fixed"/>
+        <w:tblCellMar>
+          <w:top w:w="0" w:type="dxa"/>
+          <w:left w:w="108" w:type="dxa"/>
+          <w:bottom w:w="0" w:type="dxa"/>
+          <w:right w:w="108" w:type="dxa"/>
+        </w:tblCellMar>
+      </w:tblPr>
+      <w:tblGrid>
+        <w:gridCol w:w="1545"/>
+        <w:gridCol w:w="6417"/>
+      </w:tblGrid>
+      <w:tr>
+        <w:tblPrEx>
+          <w:tblBorders>
+            <w:top w:val="none" w:color="auto" w:sz="0" w:space="0"/>
+            <w:left w:val="none" w:color="auto" w:sz="0" w:space="0"/>
+            <w:bottom w:val="none" w:color="auto" w:sz="0" w:space="0"/>
+            <w:right w:val="none" w:color="auto" w:sz="0" w:space="0"/>
+            <w:insideH w:val="none" w:color="auto" w:sz="0" w:space="0"/>
+            <w:insideV w:val="none" w:color="auto" w:sz="0" w:space="0"/>
+          </w:tblBorders>
+          <w:tblLayout w:type="fixed"/>
+          <w:tblCellMar>
+            <w:top w:w="0" w:type="dxa"/>
+            <w:left w:w="108" w:type="dxa"/>
+            <w:bottom w:w="0" w:type="dxa"/>
+            <w:right w:w="108" w:type="dxa"/>
+          </w:tblCellMar>
+        </w:tblPrEx>
+        <w:trPr>
+          <w:trHeight w:val="0" w:hRule="atLeast"/>
+        </w:trPr>
+        <w:tc>
+          <w:tcPr>
+            <w:tcW w:w="1545" w:type="dxa"/>
+            <w:tcBorders>
+              <w:tl2br w:val="nil"/>
+              <w:tr2bl w:val="nil"/>
+            </w:tcBorders>
+            <w:vAlign w:val="bottom"/>
+          </w:tcPr>
+          <w:p>
+            <w:pPr>
+              <w:widowControl w:val="0"/>
+              <w:numPr>
+                <w:ilvl w:val="0"/>
+                <w:numId w:val="0"/>
+              </w:numPr>
+              <w:jc w:val="both"/>
+              <w:outlineLvl w:val="0"/>
+              <w:rPr>
+                <w:rFonts w:hint="default" w:asciiTheme="majorEastAsia" w:hAnsiTheme="majorEastAsia" w:eastAsiaTheme="majorEastAsia" w:cstheme="majorEastAsia"/>
+                <w:b w:val="0"/>
+                <w:bCs w:val="0"/>
+                <w:i/>
+                <w:iCs/>
+                <w:color w:val="auto"/>
+                <w:sz w:val="20"/>
+                <w:szCs w:val="20"/>
+                <w:vertAlign w:val="baseline"/>
+              </w:rPr>
+            </w:pPr>
+            <w:r>
+              <w:rPr>
+                <w:rFonts w:hint="default" w:asciiTheme="majorEastAsia" w:hAnsiTheme="majorEastAsia" w:eastAsiaTheme="majorEastAsia" w:cstheme="majorEastAsia"/>
+                <w:b/>
+                <w:bCs/>
+                <w:i w:val="0"/>
+                <w:iCs w:val="0"/>
+                <w:color w:val="auto"/>
+                <w:sz w:val="20"/>
+                <w:szCs w:val="20"/>
+              </w:rPr>
+              <w:t>Directory:</w:t>
+            </w:r>
+          </w:p>
+        </w:tc>
+        <w:tc>
+          <w:tcPr>
+            <w:tcW w:w="6417" w:type="dxa"/>
+            <w:tcBorders>
+              <w:tl2br w:val="nil"/>
+              <w:tr2bl w:val="nil"/>
+            </w:tcBorders>
+            <w:vAlign w:val="bottom"/>
+          </w:tcPr>
+          <w:p>
+            <w:pPr>
+              <w:widowControl w:val="0"/>
+              <w:numPr>
+                <w:ilvl w:val="0"/>
+                <w:numId w:val="0"/>
+              </w:numPr>
+              <w:jc w:val="both"/>
+              <w:outlineLvl w:val="0"/>
+              <w:rPr>
+                <w:rFonts w:hint="default" w:asciiTheme="majorEastAsia" w:hAnsiTheme="majorEastAsia" w:eastAsiaTheme="majorEastAsia" w:cstheme="majorEastAsia"/>
+                <w:b w:val="0"/>
+                <w:bCs w:val="0"/>
+                <w:i w:val="0"/>
+                <w:iCs w:val="0"/>
+                <w:color w:val="auto"/>
+                <w:sz w:val="20"/>
+                <w:szCs w:val="20"/>
+                <w:vertAlign w:val="baseline"/>
+              </w:rPr>
+            </w:pPr>
+            <w:r>
+              <w:rPr>
+                <w:rFonts w:hint="default" w:asciiTheme="majorEastAsia" w:hAnsiTheme="majorEastAsia" w:eastAsiaTheme="majorEastAsia" w:cstheme="majorEastAsia"/>
+                <w:b w:val="0"/>
+                <w:bCs w:val="0"/>
+                <w:i w:val="0"/>
+                <w:iCs w:val="0"/>
+                <w:color w:val="auto"/>
+                <w:sz w:val="20"/>
+                <w:szCs w:val="20"/>
+              </w:rPr>
+              <w:t>“${PROJ_ROOT}/rtl</w:t>
+            </w:r>
+            <w:r>
+              <w:rPr>
+                <w:rFonts w:hint="default" w:asciiTheme="majorEastAsia" w:hAnsiTheme="majorEastAsia" w:eastAsiaTheme="majorEastAsia" w:cstheme="majorEastAsia"/>
+                <w:b w:val="0"/>
+                <w:bCs w:val="0"/>
+                <w:i w:val="0"/>
+                <w:iCs w:val="0"/>
+                <w:color w:val="auto"/>
+                <w:sz w:val="20"/>
+                <w:szCs w:val="20"/>
+              </w:rPr>
+              <w:t>/common</w:t>
+            </w:r>
+            <w:r>
+              <w:rPr>
+                <w:rFonts w:hint="default" w:asciiTheme="majorEastAsia" w:hAnsiTheme="majorEastAsia" w:eastAsiaTheme="majorEastAsia" w:cstheme="majorEastAsia"/>
+                <w:b w:val="0"/>
+                <w:bCs w:val="0"/>
+                <w:i w:val="0"/>
+                <w:iCs w:val="0"/>
+                <w:color w:val="auto"/>
+                <w:sz w:val="20"/>
+                <w:szCs w:val="20"/>
+              </w:rPr>
+              <w:t>/”</w:t>
+            </w:r>
+          </w:p>
+        </w:tc>
+      </w:tr>
+      <w:tr>
+        <w:tblPrEx>
+          <w:tblBorders>
+            <w:top w:val="none" w:color="auto" w:sz="0" w:space="0"/>
+            <w:left w:val="none" w:color="auto" w:sz="0" w:space="0"/>
+            <w:bottom w:val="none" w:color="auto" w:sz="0" w:space="0"/>
+            <w:right w:val="none" w:color="auto" w:sz="0" w:space="0"/>
+            <w:insideH w:val="none" w:color="auto" w:sz="0" w:space="0"/>
+            <w:insideV w:val="none" w:color="auto" w:sz="0" w:space="0"/>
+          </w:tblBorders>
+          <w:tblLayout w:type="fixed"/>
+          <w:tblCellMar>
+            <w:top w:w="0" w:type="dxa"/>
+            <w:left w:w="108" w:type="dxa"/>
+            <w:bottom w:w="0" w:type="dxa"/>
+            <w:right w:w="108" w:type="dxa"/>
+          </w:tblCellMar>
+        </w:tblPrEx>
+        <w:trPr>
+          <w:trHeight w:val="0" w:hRule="atLeast"/>
+        </w:trPr>
+        <w:tc>
+          <w:tcPr>
+            <w:tcW w:w="1545" w:type="dxa"/>
+            <w:tcBorders>
+              <w:tl2br w:val="nil"/>
+              <w:tr2bl w:val="nil"/>
+            </w:tcBorders>
+            <w:vAlign w:val="bottom"/>
+          </w:tcPr>
+          <w:p>
+            <w:pPr>
+              <w:widowControl w:val="0"/>
+              <w:numPr>
+                <w:ilvl w:val="0"/>
+                <w:numId w:val="0"/>
+              </w:numPr>
+              <w:jc w:val="both"/>
+              <w:outlineLvl w:val="0"/>
+              <w:rPr>
+                <w:rFonts w:hint="default" w:asciiTheme="majorEastAsia" w:hAnsiTheme="majorEastAsia" w:eastAsiaTheme="majorEastAsia" w:cstheme="majorEastAsia"/>
+                <w:b w:val="0"/>
+                <w:bCs w:val="0"/>
+                <w:i/>
+                <w:iCs/>
+                <w:color w:val="auto"/>
+                <w:sz w:val="20"/>
+                <w:szCs w:val="20"/>
+                <w:vertAlign w:val="baseline"/>
+              </w:rPr>
+            </w:pPr>
+            <w:r>
+              <w:rPr>
+                <w:rFonts w:hint="default" w:asciiTheme="majorEastAsia" w:hAnsiTheme="majorEastAsia" w:eastAsiaTheme="majorEastAsia" w:cstheme="majorEastAsia"/>
+                <w:b/>
+                <w:bCs/>
+                <w:i w:val="0"/>
+                <w:iCs w:val="0"/>
+                <w:color w:val="auto"/>
+                <w:sz w:val="20"/>
+                <w:szCs w:val="20"/>
+              </w:rPr>
+              <w:t>Top module:</w:t>
+            </w:r>
+          </w:p>
+        </w:tc>
+        <w:tc>
+          <w:tcPr>
+            <w:tcW w:w="6417" w:type="dxa"/>
+            <w:tcBorders>
+              <w:tl2br w:val="nil"/>
+              <w:tr2bl w:val="nil"/>
+            </w:tcBorders>
+            <w:vAlign w:val="bottom"/>
+          </w:tcPr>
+          <w:p>
+            <w:pPr>
+              <w:widowControl w:val="0"/>
+              <w:numPr>
+                <w:ilvl w:val="0"/>
+                <w:numId w:val="0"/>
+              </w:numPr>
+              <w:jc w:val="both"/>
+              <w:outlineLvl w:val="0"/>
+              <w:rPr>
+                <w:rFonts w:hint="default" w:asciiTheme="majorEastAsia" w:hAnsiTheme="majorEastAsia" w:eastAsiaTheme="majorEastAsia" w:cstheme="majorEastAsia"/>
+                <w:b w:val="0"/>
+                <w:bCs w:val="0"/>
+                <w:i w:val="0"/>
+                <w:iCs w:val="0"/>
+                <w:color w:val="auto"/>
+                <w:sz w:val="20"/>
+                <w:szCs w:val="20"/>
+                <w:vertAlign w:val="baseline"/>
+              </w:rPr>
+            </w:pPr>
+            <w:r>
+              <w:rPr>
+                <w:rFonts w:hint="default" w:asciiTheme="majorEastAsia" w:hAnsiTheme="majorEastAsia" w:eastAsiaTheme="majorEastAsia" w:cstheme="majorEastAsia"/>
+                <w:b w:val="0"/>
+                <w:bCs w:val="0"/>
+                <w:i w:val="0"/>
+                <w:iCs w:val="0"/>
+                <w:color w:val="auto"/>
+                <w:sz w:val="20"/>
+                <w:szCs w:val="20"/>
+              </w:rPr>
+              <w:t>“spmcu_</w:t>
+            </w:r>
+            <w:r>
+              <w:rPr>
+                <w:rFonts w:hint="default" w:asciiTheme="majorEastAsia" w:hAnsiTheme="majorEastAsia" w:eastAsiaTheme="majorEastAsia" w:cstheme="majorEastAsia"/>
+                <w:b w:val="0"/>
+                <w:bCs w:val="0"/>
+                <w:i w:val="0"/>
+                <w:iCs w:val="0"/>
+                <w:color w:val="auto"/>
+                <w:sz w:val="20"/>
+                <w:szCs w:val="20"/>
+              </w:rPr>
+              <w:t>rr_arbiter</w:t>
+            </w:r>
+            <w:bookmarkStart w:id="0" w:name="_GoBack"/>
+            <w:bookmarkEnd w:id="0"/>
+            <w:r>
+              <w:rPr>
+                <w:rFonts w:hint="default" w:asciiTheme="majorEastAsia" w:hAnsiTheme="majorEastAsia" w:eastAsiaTheme="majorEastAsia" w:cstheme="majorEastAsia"/>
+                <w:b w:val="0"/>
+                <w:bCs w:val="0"/>
+                <w:i w:val="0"/>
+                <w:iCs w:val="0"/>
+                <w:color w:val="auto"/>
+                <w:sz w:val="20"/>
+                <w:szCs w:val="20"/>
+              </w:rPr>
+              <w:t>.sv”</w:t>
+            </w:r>
+          </w:p>
+        </w:tc>
+      </w:tr>
+    </w:tbl>
+    <w:p>
+      <w:pPr>
+        <w:numPr>
+          <w:numId w:val="0"/>
+        </w:numPr>
+        <w:ind w:left="0" w:leftChars="0" w:firstLine="402" w:firstLineChars="200"/>
+        <w:jc w:val="left"/>
+        <w:outlineLvl w:val="0"/>
+        <w:rPr>
+          <w:rFonts w:hint="eastAsia" w:asciiTheme="majorEastAsia" w:hAnsiTheme="majorEastAsia" w:eastAsiaTheme="majorEastAsia" w:cstheme="majorEastAsia"/>
+          <w:b/>
+          <w:bCs/>
+          <w:i w:val="0"/>
+          <w:iCs w:val="0"/>
+          <w:color w:val="002060"/>
+          <w:sz w:val="20"/>
+          <w:szCs w:val="20"/>
+        </w:rPr>
+      </w:pPr>
+    </w:p>
+    <w:p>
+      <w:pPr>
+        <w:numPr>
+          <w:ilvl w:val="0"/>
+          <w:numId w:val="3"/>
+        </w:numPr>
+        <w:jc w:val="left"/>
+        <w:outlineLvl w:val="0"/>
+        <w:rPr>
+          <w:rFonts w:hint="eastAsia" w:asciiTheme="majorEastAsia" w:hAnsiTheme="majorEastAsia" w:eastAsiaTheme="majorEastAsia" w:cstheme="majorEastAsia"/>
+          <w:b/>
+          <w:bCs/>
+          <w:i w:val="0"/>
+          <w:iCs w:val="0"/>
+          <w:color w:val="002060"/>
+          <w:sz w:val="20"/>
+          <w:szCs w:val="20"/>
+        </w:rPr>
+      </w:pPr>
+      <w:r>
+        <w:rPr>
+          <w:rFonts w:hint="default" w:asciiTheme="majorEastAsia" w:hAnsiTheme="majorEastAsia" w:eastAsiaTheme="majorEastAsia" w:cstheme="majorEastAsia"/>
+          <w:b/>
+          <w:bCs/>
+          <w:i w:val="0"/>
+          <w:iCs w:val="0"/>
+          <w:color w:val="002060"/>
+          <w:sz w:val="20"/>
+          <w:szCs w:val="20"/>
+        </w:rPr>
         <w:t>RISC-V Core</w:t>
       </w:r>
     </w:p>
@@ -5319,8 +5710,8 @@
         </w:tblCellMar>
       </w:tblPr>
       <w:tblGrid>
-        <w:gridCol w:w="2133"/>
-        <w:gridCol w:w="5829"/>
+        <w:gridCol w:w="1545"/>
+        <w:gridCol w:w="6417"/>
       </w:tblGrid>
       <w:tr>
         <w:tblPrEx>
@@ -5345,7 +5736,7 @@
         </w:trPr>
         <w:tc>
           <w:tcPr>
-            <w:tcW w:w="2133" w:type="dxa"/>
+            <w:tcW w:w="1545" w:type="dxa"/>
             <w:tcBorders>
               <w:tl2br w:val="nil"/>
               <w:tr2bl w:val="nil"/>
@@ -5384,13 +5775,26 @@
                 <w:sz w:val="20"/>
                 <w:szCs w:val="20"/>
               </w:rPr>
-              <w:t>Release directory:</w:t>
-            </w:r>
-          </w:p>
-        </w:tc>
-        <w:tc>
-          <w:tcPr>
-            <w:tcW w:w="5829" w:type="dxa"/>
+              <w:t>D</w:t>
+            </w:r>
+            <w:r>
+              <w:rPr>
+                <w:rFonts w:hint="default" w:asciiTheme="majorEastAsia" w:hAnsiTheme="majorEastAsia" w:eastAsiaTheme="majorEastAsia" w:cstheme="majorEastAsia"/>
+                <w:b/>
+                <w:bCs/>
+                <w:i w:val="0"/>
+                <w:iCs w:val="0"/>
+                <w:color w:val="auto"/>
+                <w:sz w:val="20"/>
+                <w:szCs w:val="20"/>
+              </w:rPr>
+              <w:t>irectory:</w:t>
+            </w:r>
+          </w:p>
+        </w:tc>
+        <w:tc>
+          <w:tcPr>
+            <w:tcW w:w="6417" w:type="dxa"/>
             <w:tcBorders>
               <w:tl2br w:val="nil"/>
               <w:tr2bl w:val="nil"/>
@@ -5457,7 +5861,7 @@
         </w:trPr>
         <w:tc>
           <w:tcPr>
-            <w:tcW w:w="2133" w:type="dxa"/>
+            <w:tcW w:w="1545" w:type="dxa"/>
             <w:tcBorders>
               <w:tl2br w:val="nil"/>
               <w:tr2bl w:val="nil"/>
@@ -5502,7 +5906,7 @@
         </w:tc>
         <w:tc>
           <w:tcPr>
-            <w:tcW w:w="5829" w:type="dxa"/>
+            <w:tcW w:w="6417" w:type="dxa"/>
             <w:tcBorders>
               <w:tl2br w:val="nil"/>
               <w:tr2bl w:val="nil"/>
@@ -5578,20 +5982,7 @@
           <w:sz w:val="20"/>
           <w:szCs w:val="20"/>
         </w:rPr>
-        <w:t>&lt;Chuc nang, tinh nang, diem dac biet</w:t>
-      </w:r>
-      <w:r>
-        <w:rPr>
-          <w:rFonts w:hint="default" w:asciiTheme="majorEastAsia" w:hAnsiTheme="majorEastAsia" w:eastAsiaTheme="majorEastAsia" w:cstheme="majorEastAsia"/>
-          <w:b w:val="0"/>
-          <w:bCs w:val="0"/>
-          <w:i w:val="0"/>
-          <w:iCs w:val="0"/>
-          <w:color w:val="auto"/>
-          <w:sz w:val="20"/>
-          <w:szCs w:val="20"/>
-        </w:rPr>
-        <w:t>&gt;</w:t>
+        <w:t>&lt;Chuc nang, tinh nang, diem dac biet&gt;</w:t>
       </w:r>
     </w:p>
     <w:p>
@@ -6046,33 +6437,7 @@
           <w:sz w:val="20"/>
           <w:szCs w:val="20"/>
         </w:rPr>
-        <w:t>*To ON/OFF these defines, modify ‘${PROJ_ROOT}/rtl/ahb/interconnect/spmcu_ahb_ interconnect_define.sv</w:t>
-      </w:r>
-      <w:r>
-        <w:rPr>
-          <w:rFonts w:hint="default" w:asciiTheme="majorEastAsia" w:hAnsiTheme="majorEastAsia" w:eastAsiaTheme="majorEastAsia" w:cstheme="majorEastAsia"/>
-          <w:b w:val="0"/>
-          <w:bCs w:val="0"/>
-          <w:i w:val="0"/>
-          <w:iCs w:val="0"/>
-          <w:color w:val="auto"/>
-          <w:sz w:val="20"/>
-          <w:szCs w:val="20"/>
-        </w:rPr>
-        <w:t>h</w:t>
-      </w:r>
-      <w:r>
-        <w:rPr>
-          <w:rFonts w:hint="default" w:asciiTheme="majorEastAsia" w:hAnsiTheme="majorEastAsia" w:eastAsiaTheme="majorEastAsia" w:cstheme="majorEastAsia"/>
-          <w:b w:val="0"/>
-          <w:bCs w:val="0"/>
-          <w:i w:val="0"/>
-          <w:iCs w:val="0"/>
-          <w:color w:val="auto"/>
-          <w:sz w:val="20"/>
-          <w:szCs w:val="20"/>
-        </w:rPr>
-        <w:t>’</w:t>
+        <w:t>*To ON/OFF these defines, modify ‘${PROJ_ROOT}/rtl/ahb/interconnect/spmcu_ahb_ interconnect_define.svh’</w:t>
       </w:r>
     </w:p>
     <w:p>
@@ -7615,31 +7980,7 @@
                 <w:szCs w:val="20"/>
                 <w:vertAlign w:val="baseline"/>
               </w:rPr>
-              <w:t>AHB</w:t>
-            </w:r>
-            <w:r>
-              <w:rPr>
-                <w:rFonts w:hint="default" w:asciiTheme="majorEastAsia" w:hAnsiTheme="majorEastAsia" w:eastAsiaTheme="majorEastAsia" w:cstheme="majorEastAsia"/>
-                <w:b/>
-                <w:bCs/>
-                <w:color w:val="auto"/>
-                <w:sz w:val="20"/>
-                <w:szCs w:val="20"/>
-                <w:vertAlign w:val="baseline"/>
-              </w:rPr>
-              <w:t xml:space="preserve"> Master</w:t>
-            </w:r>
-            <w:r>
-              <w:rPr>
-                <w:rFonts w:hint="default" w:asciiTheme="majorEastAsia" w:hAnsiTheme="majorEastAsia" w:eastAsiaTheme="majorEastAsia" w:cstheme="majorEastAsia"/>
-                <w:b/>
-                <w:bCs/>
-                <w:color w:val="auto"/>
-                <w:sz w:val="20"/>
-                <w:szCs w:val="20"/>
-                <w:vertAlign w:val="baseline"/>
-              </w:rPr>
-              <w:t xml:space="preserve"> side --------------------------------------------------------------------------------------------------</w:t>
+              <w:t>AHB Master side --------------------------------------------------------------------------------------------------</w:t>
             </w:r>
           </w:p>
         </w:tc>
@@ -7700,19 +8041,7 @@
                 <w:szCs w:val="20"/>
                 <w:vertAlign w:val="baseline"/>
               </w:rPr>
-              <w:t>mst_haddr_</w:t>
-            </w:r>
-            <w:r>
-              <w:rPr>
-                <w:rFonts w:hint="default" w:asciiTheme="majorEastAsia" w:hAnsiTheme="majorEastAsia" w:eastAsiaTheme="majorEastAsia" w:cstheme="majorEastAsia"/>
-                <w:b w:val="0"/>
-                <w:bCs w:val="0"/>
-                <w:color w:val="auto"/>
-                <w:sz w:val="20"/>
-                <w:szCs w:val="20"/>
-                <w:vertAlign w:val="baseline"/>
-              </w:rPr>
-              <w:t>i</w:t>
+              <w:t>mst_haddr_i</w:t>
             </w:r>
           </w:p>
         </w:tc>
@@ -7887,19 +8216,7 @@
                 <w:szCs w:val="20"/>
                 <w:vertAlign w:val="baseline"/>
               </w:rPr>
-              <w:t>mst_hburst_</w:t>
-            </w:r>
-            <w:r>
-              <w:rPr>
-                <w:rFonts w:hint="default" w:asciiTheme="majorEastAsia" w:hAnsiTheme="majorEastAsia" w:eastAsiaTheme="majorEastAsia" w:cstheme="majorEastAsia"/>
-                <w:b w:val="0"/>
-                <w:bCs w:val="0"/>
-                <w:color w:val="auto"/>
-                <w:sz w:val="20"/>
-                <w:szCs w:val="20"/>
-                <w:vertAlign w:val="baseline"/>
-              </w:rPr>
-              <w:t>i</w:t>
+              <w:t>mst_hburst_i</w:t>
             </w:r>
           </w:p>
         </w:tc>
@@ -8062,19 +8379,7 @@
                 <w:szCs w:val="20"/>
                 <w:vertAlign w:val="baseline"/>
               </w:rPr>
-              <w:t>mst_hsize_</w:t>
-            </w:r>
-            <w:r>
-              <w:rPr>
-                <w:rFonts w:hint="default" w:asciiTheme="majorEastAsia" w:hAnsiTheme="majorEastAsia" w:eastAsiaTheme="majorEastAsia" w:cstheme="majorEastAsia"/>
-                <w:b w:val="0"/>
-                <w:bCs w:val="0"/>
-                <w:color w:val="auto"/>
-                <w:sz w:val="20"/>
-                <w:szCs w:val="20"/>
-                <w:vertAlign w:val="baseline"/>
-              </w:rPr>
-              <w:t>i</w:t>
+              <w:t>mst_hsize_i</w:t>
             </w:r>
           </w:p>
         </w:tc>
@@ -8237,19 +8542,7 @@
                 <w:szCs w:val="20"/>
                 <w:vertAlign w:val="baseline"/>
               </w:rPr>
-              <w:t>mst_htrans_</w:t>
-            </w:r>
-            <w:r>
-              <w:rPr>
-                <w:rFonts w:hint="default" w:asciiTheme="majorEastAsia" w:hAnsiTheme="majorEastAsia" w:eastAsiaTheme="majorEastAsia" w:cstheme="majorEastAsia"/>
-                <w:b w:val="0"/>
-                <w:bCs w:val="0"/>
-                <w:color w:val="auto"/>
-                <w:sz w:val="20"/>
-                <w:szCs w:val="20"/>
-                <w:vertAlign w:val="baseline"/>
-              </w:rPr>
-              <w:t>i</w:t>
+              <w:t>mst_htrans_i</w:t>
             </w:r>
           </w:p>
         </w:tc>
@@ -8412,19 +8705,7 @@
                 <w:szCs w:val="20"/>
                 <w:vertAlign w:val="baseline"/>
               </w:rPr>
-              <w:t>mst_hwdata_</w:t>
-            </w:r>
-            <w:r>
-              <w:rPr>
-                <w:rFonts w:hint="default" w:asciiTheme="majorEastAsia" w:hAnsiTheme="majorEastAsia" w:eastAsiaTheme="majorEastAsia" w:cstheme="majorEastAsia"/>
-                <w:b w:val="0"/>
-                <w:bCs w:val="0"/>
-                <w:color w:val="auto"/>
-                <w:sz w:val="20"/>
-                <w:szCs w:val="20"/>
-                <w:vertAlign w:val="baseline"/>
-              </w:rPr>
-              <w:t>i</w:t>
+              <w:t>mst_hwdata_i</w:t>
             </w:r>
           </w:p>
         </w:tc>
@@ -8587,19 +8868,7 @@
                 <w:szCs w:val="20"/>
                 <w:vertAlign w:val="baseline"/>
               </w:rPr>
-              <w:t>mst_hwstrb_</w:t>
-            </w:r>
-            <w:r>
-              <w:rPr>
-                <w:rFonts w:hint="default" w:asciiTheme="majorEastAsia" w:hAnsiTheme="majorEastAsia" w:eastAsiaTheme="majorEastAsia" w:cstheme="majorEastAsia"/>
-                <w:b w:val="0"/>
-                <w:bCs w:val="0"/>
-                <w:color w:val="auto"/>
-                <w:sz w:val="20"/>
-                <w:szCs w:val="20"/>
-                <w:vertAlign w:val="baseline"/>
-              </w:rPr>
-              <w:t>i</w:t>
+              <w:t>mst_hwstrb_i</w:t>
             </w:r>
           </w:p>
         </w:tc>
@@ -8762,19 +9031,7 @@
                 <w:szCs w:val="20"/>
                 <w:vertAlign w:val="baseline"/>
               </w:rPr>
-              <w:t>mst_hwrite_</w:t>
-            </w:r>
-            <w:r>
-              <w:rPr>
-                <w:rFonts w:hint="default" w:asciiTheme="majorEastAsia" w:hAnsiTheme="majorEastAsia" w:eastAsiaTheme="majorEastAsia" w:cstheme="majorEastAsia"/>
-                <w:b w:val="0"/>
-                <w:bCs w:val="0"/>
-                <w:color w:val="auto"/>
-                <w:sz w:val="20"/>
-                <w:szCs w:val="20"/>
-                <w:vertAlign w:val="baseline"/>
-              </w:rPr>
-              <w:t>i</w:t>
+              <w:t>mst_hwrite_i</w:t>
             </w:r>
           </w:p>
         </w:tc>
@@ -8937,19 +9194,7 @@
                 <w:szCs w:val="20"/>
                 <w:vertAlign w:val="baseline"/>
               </w:rPr>
-              <w:t>mst_hrdata_</w:t>
-            </w:r>
-            <w:r>
-              <w:rPr>
-                <w:rFonts w:hint="default" w:asciiTheme="majorEastAsia" w:hAnsiTheme="majorEastAsia" w:eastAsiaTheme="majorEastAsia" w:cstheme="majorEastAsia"/>
-                <w:b w:val="0"/>
-                <w:bCs w:val="0"/>
-                <w:color w:val="auto"/>
-                <w:sz w:val="20"/>
-                <w:szCs w:val="20"/>
-                <w:vertAlign w:val="baseline"/>
-              </w:rPr>
-              <w:t>o</w:t>
+              <w:t>mst_hrdata_o</w:t>
             </w:r>
           </w:p>
         </w:tc>
@@ -9113,19 +9358,7 @@
                 <w:szCs w:val="20"/>
                 <w:vertAlign w:val="baseline"/>
               </w:rPr>
-              <w:t>mst_hresp_</w:t>
-            </w:r>
-            <w:r>
-              <w:rPr>
-                <w:rFonts w:hint="default" w:asciiTheme="majorEastAsia" w:hAnsiTheme="majorEastAsia" w:eastAsiaTheme="majorEastAsia" w:cstheme="majorEastAsia"/>
-                <w:b w:val="0"/>
-                <w:bCs w:val="0"/>
-                <w:color w:val="auto"/>
-                <w:sz w:val="20"/>
-                <w:szCs w:val="20"/>
-                <w:vertAlign w:val="baseline"/>
-              </w:rPr>
-              <w:t>o</w:t>
+              <w:t>mst_hresp_o</w:t>
             </w:r>
           </w:p>
         </w:tc>
@@ -9289,19 +9522,7 @@
                 <w:szCs w:val="20"/>
                 <w:vertAlign w:val="baseline"/>
               </w:rPr>
-              <w:t>mst_hready_</w:t>
-            </w:r>
-            <w:r>
-              <w:rPr>
-                <w:rFonts w:hint="default" w:asciiTheme="majorEastAsia" w:hAnsiTheme="majorEastAsia" w:eastAsiaTheme="majorEastAsia" w:cstheme="majorEastAsia"/>
-                <w:b w:val="0"/>
-                <w:bCs w:val="0"/>
-                <w:color w:val="auto"/>
-                <w:sz w:val="20"/>
-                <w:szCs w:val="20"/>
-                <w:vertAlign w:val="baseline"/>
-              </w:rPr>
-              <w:t>o</w:t>
+              <w:t>mst_hready_o</w:t>
             </w:r>
           </w:p>
         </w:tc>
@@ -9467,55 +9688,7 @@
                 <w:szCs w:val="20"/>
                 <w:vertAlign w:val="baseline"/>
               </w:rPr>
-              <w:t xml:space="preserve">AHB </w:t>
-            </w:r>
-            <w:r>
-              <w:rPr>
-                <w:rFonts w:hint="default" w:asciiTheme="majorEastAsia" w:hAnsiTheme="majorEastAsia" w:eastAsiaTheme="majorEastAsia" w:cstheme="majorEastAsia"/>
-                <w:b/>
-                <w:bCs/>
-                <w:color w:val="auto"/>
-                <w:sz w:val="20"/>
-                <w:szCs w:val="20"/>
-                <w:vertAlign w:val="baseline"/>
-              </w:rPr>
-              <w:t>Slave</w:t>
-            </w:r>
-            <w:r>
-              <w:rPr>
-                <w:rFonts w:hint="default" w:asciiTheme="majorEastAsia" w:hAnsiTheme="majorEastAsia" w:eastAsiaTheme="majorEastAsia" w:cstheme="majorEastAsia"/>
-                <w:b/>
-                <w:bCs/>
-                <w:color w:val="auto"/>
-                <w:sz w:val="20"/>
-                <w:szCs w:val="20"/>
-                <w:vertAlign w:val="baseline"/>
-              </w:rPr>
-              <w:t xml:space="preserve"> side -</w:t>
-            </w:r>
-            <w:r>
-              <w:rPr>
-                <w:rFonts w:hint="default" w:asciiTheme="majorEastAsia" w:hAnsiTheme="majorEastAsia" w:eastAsiaTheme="majorEastAsia" w:cstheme="majorEastAsia"/>
-                <w:b/>
-                <w:bCs/>
-                <w:color w:val="auto"/>
-                <w:sz w:val="20"/>
-                <w:szCs w:val="20"/>
-                <w:vertAlign w:val="baseline"/>
-              </w:rPr>
-              <w:t>--</w:t>
-            </w:r>
-            <w:r>
-              <w:rPr>
-                <w:rFonts w:hint="default" w:asciiTheme="majorEastAsia" w:hAnsiTheme="majorEastAsia" w:eastAsiaTheme="majorEastAsia" w:cstheme="majorEastAsia"/>
-                <w:b/>
-                <w:bCs/>
-                <w:color w:val="auto"/>
-                <w:sz w:val="20"/>
-                <w:szCs w:val="20"/>
-                <w:vertAlign w:val="baseline"/>
-              </w:rPr>
-              <w:t>-------------------------------------------------------------------------------------------------</w:t>
+              <w:t>AHB Slave side ----------------------------------------------------------------------------------------------------</w:t>
             </w:r>
           </w:p>
         </w:tc>
@@ -9576,19 +9749,7 @@
                 <w:szCs w:val="20"/>
                 <w:vertAlign w:val="baseline"/>
               </w:rPr>
-              <w:t>slv_hrdata_</w:t>
-            </w:r>
-            <w:r>
-              <w:rPr>
-                <w:rFonts w:hint="default" w:asciiTheme="majorEastAsia" w:hAnsiTheme="majorEastAsia" w:eastAsiaTheme="majorEastAsia" w:cstheme="majorEastAsia"/>
-                <w:b w:val="0"/>
-                <w:bCs w:val="0"/>
-                <w:color w:val="auto"/>
-                <w:sz w:val="20"/>
-                <w:szCs w:val="20"/>
-                <w:vertAlign w:val="baseline"/>
-              </w:rPr>
-              <w:t>i</w:t>
+              <w:t>slv_hrdata_i</w:t>
             </w:r>
           </w:p>
         </w:tc>
@@ -9751,19 +9912,7 @@
                 <w:szCs w:val="20"/>
                 <w:vertAlign w:val="baseline"/>
               </w:rPr>
-              <w:t>slv_hresp_</w:t>
-            </w:r>
-            <w:r>
-              <w:rPr>
-                <w:rFonts w:hint="default" w:asciiTheme="majorEastAsia" w:hAnsiTheme="majorEastAsia" w:eastAsiaTheme="majorEastAsia" w:cstheme="majorEastAsia"/>
-                <w:b w:val="0"/>
-                <w:bCs w:val="0"/>
-                <w:color w:val="auto"/>
-                <w:sz w:val="20"/>
-                <w:szCs w:val="20"/>
-                <w:vertAlign w:val="baseline"/>
-              </w:rPr>
-              <w:t>i</w:t>
+              <w:t>slv_hresp_i</w:t>
             </w:r>
           </w:p>
         </w:tc>
@@ -9926,19 +10075,7 @@
                 <w:szCs w:val="20"/>
                 <w:vertAlign w:val="baseline"/>
               </w:rPr>
-              <w:t>slv_hreadyout_</w:t>
-            </w:r>
-            <w:r>
-              <w:rPr>
-                <w:rFonts w:hint="default" w:asciiTheme="majorEastAsia" w:hAnsiTheme="majorEastAsia" w:eastAsiaTheme="majorEastAsia" w:cstheme="majorEastAsia"/>
-                <w:b w:val="0"/>
-                <w:bCs w:val="0"/>
-                <w:color w:val="auto"/>
-                <w:sz w:val="20"/>
-                <w:szCs w:val="20"/>
-                <w:vertAlign w:val="baseline"/>
-              </w:rPr>
-              <w:t>i</w:t>
+              <w:t>slv_hreadyout_i</w:t>
             </w:r>
           </w:p>
         </w:tc>
@@ -10101,19 +10238,7 @@
                 <w:szCs w:val="20"/>
                 <w:vertAlign w:val="baseline"/>
               </w:rPr>
-              <w:t>slv_haddr_</w:t>
-            </w:r>
-            <w:r>
-              <w:rPr>
-                <w:rFonts w:hint="default" w:asciiTheme="majorEastAsia" w:hAnsiTheme="majorEastAsia" w:eastAsiaTheme="majorEastAsia" w:cstheme="majorEastAsia"/>
-                <w:b w:val="0"/>
-                <w:bCs w:val="0"/>
-                <w:color w:val="auto"/>
-                <w:sz w:val="20"/>
-                <w:szCs w:val="20"/>
-                <w:vertAlign w:val="baseline"/>
-              </w:rPr>
-              <w:t>o</w:t>
+              <w:t>slv_haddr_o</w:t>
             </w:r>
           </w:p>
         </w:tc>
@@ -10277,19 +10402,7 @@
                 <w:szCs w:val="20"/>
                 <w:vertAlign w:val="baseline"/>
               </w:rPr>
-              <w:t>slv_hburst_</w:t>
-            </w:r>
-            <w:r>
-              <w:rPr>
-                <w:rFonts w:hint="default" w:asciiTheme="majorEastAsia" w:hAnsiTheme="majorEastAsia" w:eastAsiaTheme="majorEastAsia" w:cstheme="majorEastAsia"/>
-                <w:b w:val="0"/>
-                <w:bCs w:val="0"/>
-                <w:color w:val="auto"/>
-                <w:sz w:val="20"/>
-                <w:szCs w:val="20"/>
-                <w:vertAlign w:val="baseline"/>
-              </w:rPr>
-              <w:t>o</w:t>
+              <w:t>slv_hburst_o</w:t>
             </w:r>
           </w:p>
         </w:tc>
@@ -10453,19 +10566,7 @@
                 <w:szCs w:val="20"/>
                 <w:vertAlign w:val="baseline"/>
               </w:rPr>
-              <w:t>slv_hsize_</w:t>
-            </w:r>
-            <w:r>
-              <w:rPr>
-                <w:rFonts w:hint="default" w:asciiTheme="majorEastAsia" w:hAnsiTheme="majorEastAsia" w:eastAsiaTheme="majorEastAsia" w:cstheme="majorEastAsia"/>
-                <w:b w:val="0"/>
-                <w:bCs w:val="0"/>
-                <w:color w:val="auto"/>
-                <w:sz w:val="20"/>
-                <w:szCs w:val="20"/>
-                <w:vertAlign w:val="baseline"/>
-              </w:rPr>
-              <w:t>o</w:t>
+              <w:t>slv_hsize_o</w:t>
             </w:r>
           </w:p>
         </w:tc>
@@ -10629,19 +10730,7 @@
                 <w:szCs w:val="20"/>
                 <w:vertAlign w:val="baseline"/>
               </w:rPr>
-              <w:t>slv_htrans_</w:t>
-            </w:r>
-            <w:r>
-              <w:rPr>
-                <w:rFonts w:hint="default" w:asciiTheme="majorEastAsia" w:hAnsiTheme="majorEastAsia" w:eastAsiaTheme="majorEastAsia" w:cstheme="majorEastAsia"/>
-                <w:b w:val="0"/>
-                <w:bCs w:val="0"/>
-                <w:color w:val="auto"/>
-                <w:sz w:val="20"/>
-                <w:szCs w:val="20"/>
-                <w:vertAlign w:val="baseline"/>
-              </w:rPr>
-              <w:t>o</w:t>
+              <w:t>slv_htrans_o</w:t>
             </w:r>
           </w:p>
         </w:tc>
@@ -10805,19 +10894,7 @@
                 <w:szCs w:val="20"/>
                 <w:vertAlign w:val="baseline"/>
               </w:rPr>
-              <w:t>slv_hwdata_</w:t>
-            </w:r>
-            <w:r>
-              <w:rPr>
-                <w:rFonts w:hint="default" w:asciiTheme="majorEastAsia" w:hAnsiTheme="majorEastAsia" w:eastAsiaTheme="majorEastAsia" w:cstheme="majorEastAsia"/>
-                <w:b w:val="0"/>
-                <w:bCs w:val="0"/>
-                <w:color w:val="auto"/>
-                <w:sz w:val="20"/>
-                <w:szCs w:val="20"/>
-                <w:vertAlign w:val="baseline"/>
-              </w:rPr>
-              <w:t>o</w:t>
+              <w:t>slv_hwdata_o</w:t>
             </w:r>
           </w:p>
         </w:tc>
@@ -10981,19 +11058,7 @@
                 <w:szCs w:val="20"/>
                 <w:vertAlign w:val="baseline"/>
               </w:rPr>
-              <w:t>slv_hwstrb_</w:t>
-            </w:r>
-            <w:r>
-              <w:rPr>
-                <w:rFonts w:hint="default" w:asciiTheme="majorEastAsia" w:hAnsiTheme="majorEastAsia" w:eastAsiaTheme="majorEastAsia" w:cstheme="majorEastAsia"/>
-                <w:b w:val="0"/>
-                <w:bCs w:val="0"/>
-                <w:color w:val="auto"/>
-                <w:sz w:val="20"/>
-                <w:szCs w:val="20"/>
-                <w:vertAlign w:val="baseline"/>
-              </w:rPr>
-              <w:t>o</w:t>
+              <w:t>slv_hwstrb_o</w:t>
             </w:r>
           </w:p>
         </w:tc>
@@ -11157,19 +11222,7 @@
                 <w:szCs w:val="20"/>
                 <w:vertAlign w:val="baseline"/>
               </w:rPr>
-              <w:t>slv_hwrite_</w:t>
-            </w:r>
-            <w:r>
-              <w:rPr>
-                <w:rFonts w:hint="default" w:asciiTheme="majorEastAsia" w:hAnsiTheme="majorEastAsia" w:eastAsiaTheme="majorEastAsia" w:cstheme="majorEastAsia"/>
-                <w:b w:val="0"/>
-                <w:bCs w:val="0"/>
-                <w:color w:val="auto"/>
-                <w:sz w:val="20"/>
-                <w:szCs w:val="20"/>
-                <w:vertAlign w:val="baseline"/>
-              </w:rPr>
-              <w:t>o</w:t>
+              <w:t>slv_hwrite_o</w:t>
             </w:r>
           </w:p>
         </w:tc>
@@ -11333,19 +11386,7 @@
                 <w:szCs w:val="20"/>
                 <w:vertAlign w:val="baseline"/>
               </w:rPr>
-              <w:t>slv_hsel_</w:t>
-            </w:r>
-            <w:r>
-              <w:rPr>
-                <w:rFonts w:hint="default" w:asciiTheme="majorEastAsia" w:hAnsiTheme="majorEastAsia" w:eastAsiaTheme="majorEastAsia" w:cstheme="majorEastAsia"/>
-                <w:b w:val="0"/>
-                <w:bCs w:val="0"/>
-                <w:color w:val="auto"/>
-                <w:sz w:val="20"/>
-                <w:szCs w:val="20"/>
-                <w:vertAlign w:val="baseline"/>
-              </w:rPr>
-              <w:t>o</w:t>
+              <w:t>slv_hsel_o</w:t>
             </w:r>
           </w:p>
         </w:tc>
@@ -11424,8 +11465,6 @@
               </w:rPr>
               <w:t>NS</w:t>
             </w:r>
-            <w:bookmarkStart w:id="0" w:name="_GoBack"/>
-            <w:bookmarkEnd w:id="0"/>
           </w:p>
         </w:tc>
         <w:tc>

</xml_diff>